<commit_message>
chore: update template 10 and add PGD logic
</commit_message>
<xml_diff>
--- a/webapp/templates/TOTRINH/10_Mau_Chi_thi.docx
+++ b/webapp/templates/TOTRINH/10_Mau_Chi_thi.docx
@@ -1,25 +1,23 @@
 
 <file path=word/document.xml><?xml version="1.0" encoding="utf-8"?>
-<w:document xmlns:wpc="http://schemas.microsoft.com/office/word/2010/wordprocessingCanvas" xmlns:cx="http://schemas.microsoft.com/office/drawing/2014/chartex" xmlns:cx1="http://schemas.microsoft.com/office/drawing/2015/9/8/chartex" xmlns:cx2="http://schemas.microsoft.com/office/drawing/2015/10/21/chartex" xmlns:cx3="http://schemas.microsoft.com/office/drawing/2016/5/9/chartex" xmlns:cx4="http://schemas.microsoft.com/office/drawing/2016/5/10/chartex" xmlns:cx5="http://schemas.microsoft.com/office/drawing/2016/5/11/chartex" xmlns:cx6="http://schemas.microsoft.com/office/drawing/2016/5/12/chartex" xmlns:cx7="http://schemas.microsoft.com/office/drawing/2016/5/13/chartex" xmlns:cx8="http://schemas.microsoft.com/office/drawing/2016/5/14/chartex" xmlns:mc="http://schemas.openxmlformats.org/markup-compatibility/2006" xmlns:aink="http://schemas.microsoft.com/office/drawing/2016/ink" xmlns:am3d="http://schemas.microsoft.com/office/drawing/2017/model3d" xmlns:o="urn:schemas-microsoft-com:office:office" xmlns:oel="http://schemas.microsoft.com/office/2019/extlst" xmlns:r="http://schemas.openxmlformats.org/officeDocument/2006/relationships" xmlns:m="http://schemas.openxmlformats.org/officeDocument/2006/math" xmlns:v="urn:schemas-microsoft-com:vml" xmlns:wp14="http://schemas.microsoft.com/office/word/2010/wordprocessingDrawing" xmlns:wp="http://schemas.openxmlformats.org/drawingml/2006/wordprocessingDrawing" xmlns:w10="urn:schemas-microsoft-com:office:word" xmlns:w="http://schemas.openxmlformats.org/wordprocessingml/2006/main" xmlns:w14="http://schemas.microsoft.com/office/word/2010/wordml" xmlns:w15="http://schemas.microsoft.com/office/word/2012/wordml" xmlns:w16cex="http://schemas.microsoft.com/office/word/2018/wordml/cex" xmlns:w16cid="http://schemas.microsoft.com/office/word/2016/wordml/cid" xmlns:w16="http://schemas.microsoft.com/office/word/2018/wordml" xmlns:w16du="http://schemas.microsoft.com/office/word/2023/wordml/word16du" xmlns:w16sdtdh="http://schemas.microsoft.com/office/word/2020/wordml/sdtdatahash" xmlns:w16sdtfl="http://schemas.microsoft.com/office/word/2024/wordml/sdtformatlock" xmlns:w16se="http://schemas.microsoft.com/office/word/2015/wordml/symex" xmlns:wpg="http://schemas.microsoft.com/office/word/2010/wordprocessingGroup" xmlns:wpi="http://schemas.microsoft.com/office/word/2010/wordprocessingInk" xmlns:wne="http://schemas.microsoft.com/office/word/2006/wordml" xmlns:wps="http://schemas.microsoft.com/office/word/2010/wordprocessingShape" mc:Ignorable="w14 w15 w16se w16cid w16 w16cex w16sdtdh w16sdtfl w16du wp14">
+<w:document xmlns:wpc="http://schemas.microsoft.com/office/word/2010/wordprocessingCanvas" xmlns:cx="http://schemas.microsoft.com/office/drawing/2014/chartex" xmlns:cx1="http://schemas.microsoft.com/office/drawing/2015/9/8/chartex" xmlns:cx2="http://schemas.microsoft.com/office/drawing/2015/10/21/chartex" xmlns:cx3="http://schemas.microsoft.com/office/drawing/2016/5/9/chartex" xmlns:cx4="http://schemas.microsoft.com/office/drawing/2016/5/10/chartex" xmlns:cx5="http://schemas.microsoft.com/office/drawing/2016/5/11/chartex" xmlns:cx6="http://schemas.microsoft.com/office/drawing/2016/5/12/chartex" xmlns:cx7="http://schemas.microsoft.com/office/drawing/2016/5/13/chartex" xmlns:cx8="http://schemas.microsoft.com/office/drawing/2016/5/14/chartex" xmlns:mc="http://schemas.openxmlformats.org/markup-compatibility/2006" xmlns:aink="http://schemas.microsoft.com/office/drawing/2016/ink" xmlns:am3d="http://schemas.microsoft.com/office/drawing/2017/model3d" xmlns:o="urn:schemas-microsoft-com:office:office" xmlns:oel="http://schemas.microsoft.com/office/2019/extlst" xmlns:r="http://schemas.openxmlformats.org/officeDocument/2006/relationships" xmlns:m="http://schemas.openxmlformats.org/officeDocument/2006/math" xmlns:v="urn:schemas-microsoft-com:vml" xmlns:wp14="http://schemas.microsoft.com/office/word/2010/wordprocessingDrawing" xmlns:wp="http://schemas.openxmlformats.org/drawingml/2006/wordprocessingDrawing" xmlns:w10="urn:schemas-microsoft-com:office:word" xmlns:w="http://schemas.openxmlformats.org/wordprocessingml/2006/main" xmlns:w14="http://schemas.microsoft.com/office/word/2010/wordml" xmlns:w15="http://schemas.microsoft.com/office/word/2012/wordml" xmlns:w16cei="http://schemas.microsoft.com/office/word/2026/wordml/cei" xmlns:w16cex="http://schemas.microsoft.com/office/word/2018/wordml/cex" xmlns:w16cid="http://schemas.microsoft.com/office/word/2016/wordml/cid" xmlns:w16="http://schemas.microsoft.com/office/word/2018/wordml" xmlns:w16du="http://schemas.microsoft.com/office/word/2023/wordml/word16du" xmlns:w16sdtdh="http://schemas.microsoft.com/office/word/2020/wordml/sdtdatahash" xmlns:w16sdtfl="http://schemas.microsoft.com/office/word/2024/wordml/sdtformatlock" xmlns:w16se="http://schemas.microsoft.com/office/word/2015/wordml/symex" xmlns:wpg="http://schemas.microsoft.com/office/word/2010/wordprocessingGroup" xmlns:wpi="http://schemas.microsoft.com/office/word/2010/wordprocessingInk" xmlns:wne="http://schemas.microsoft.com/office/word/2006/wordml" xmlns:wps="http://schemas.microsoft.com/office/word/2010/wordprocessingShape" mc:Ignorable="w14 w15 w16se w16cid w16 w16cex w16sdtdh w16sdtfl w16du wp14">
   <w:body>
     <w:tbl>
       <w:tblPr>
         <w:tblW w:w="9421" w:type="dxa"/>
         <w:tblInd w:w="-113" w:type="dxa"/>
+        <w:tblBorders>
+          <w:bottom w:val="single" w:sz="8" w:space="0" w:color="auto"/>
+        </w:tblBorders>
         <w:tblLayout w:type="fixed"/>
         <w:tblLook w:val="0000" w:firstRow="0" w:lastRow="0" w:firstColumn="0" w:lastColumn="0" w:noHBand="0" w:noVBand="0"/>
       </w:tblPr>
       <w:tblGrid>
-        <w:gridCol w:w="113"/>
-        <w:gridCol w:w="3646"/>
-        <w:gridCol w:w="5662"/>
+        <w:gridCol w:w="3742"/>
+        <w:gridCol w:w="5670"/>
+        <w:gridCol w:w="9"/>
       </w:tblGrid>
       <w:tr>
-        <w:tblPrEx>
-          <w:tblBorders>
-            <w:bottom w:val="single" w:sz="8" w:space="0" w:color="auto"/>
-          </w:tblBorders>
-        </w:tblPrEx>
         <w:trPr>
           <w:cantSplit/>
           <w:trHeight w:val="9"/>
@@ -38,67 +36,25 @@
               <w:rPr>
                 <w:rFonts w:ascii="Times New Roman" w:hAnsi="Times New Roman"/>
                 <w:b/>
+                <w:lang w:val="vi-VN"/>
               </w:rPr>
             </w:pPr>
-            <w:r>
-              <w:rPr>
-                <w:rFonts w:ascii="Times New Roman" w:hAnsi="Times New Roman"/>
-                <w:b/>
-              </w:rPr>
-            </w:r>
-            <w:r>
-              <w:rPr>
-                <w:rFonts w:ascii="Times New Roman" w:hAnsi="Times New Roman"/>
-                <w:b/>
-              </w:rPr>
-            </w:r>
-          </w:p>
-          <w:p>
-            <w:pPr>
-              <w:pStyle w:val="BodyTextIndent"/>
-              <w:spacing w:after="0"/>
-              <w:ind w:firstLine="0"/>
-              <w:jc w:val="left"/>
-              <w:rPr>
-                <w:rFonts w:ascii="Times New Roman" w:hAnsi="Times New Roman"/>
-                <w:b/>
-              </w:rPr>
-            </w:pPr>
-            <w:r>
-              <w:rPr>
-                <w:rFonts w:ascii="Times New Roman" w:hAnsi="Times New Roman"/>
-                <w:b/>
-              </w:rPr>
-              <w:t xml:space="preserve">Mẫu </w:t>
-            </w:r>
-            <w:r>
-              <w:rPr>
-                <w:rFonts w:ascii="Times New Roman" w:hAnsi="Times New Roman"/>
-                <w:b/>
-              </w:rPr>
-              <w:t>10. Chỉ thị</w:t>
-            </w:r>
           </w:p>
         </w:tc>
       </w:tr>
-    </w:tbl>
-    <w:tbl>
-      <w:tblPr>
-        <w:tblW w:w="0" w:type="auto"/>
-        <w:tblInd w:w="-113" w:type="dxa"/>
-        <w:tblLayout w:type="fixed"/>
-        <w:tblCellMar>
-          <w:left w:w="85" w:type="dxa"/>
-          <w:right w:w="85" w:type="dxa"/>
-        </w:tblCellMar>
-        <w:tblLook w:val="0000" w:firstRow="0" w:lastRow="0" w:firstColumn="0" w:lastColumn="0" w:noHBand="0" w:noVBand="0"/>
-      </w:tblPr>
-      <w:tblGrid>
-        <w:gridCol w:w="3742"/>
-        <w:gridCol w:w="5670"/>
-      </w:tblGrid>
       <w:tr>
+        <w:tblPrEx>
+          <w:tblBorders>
+            <w:bottom w:val="none" w:sz="0" w:space="0" w:color="auto"/>
+          </w:tblBorders>
+          <w:tblCellMar>
+            <w:left w:w="85" w:type="dxa"/>
+            <w:right w:w="85" w:type="dxa"/>
+          </w:tblCellMar>
+        </w:tblPrEx>
         <w:trPr>
+          <w:gridAfter w:val="1"/>
+          <w:wAfter w:w="9" w:type="dxa"/>
           <w:cantSplit/>
           <w:trHeight w:val="735"/>
         </w:trPr>
@@ -111,33 +67,23 @@
               <w:jc w:val="center"/>
               <w:rPr>
                 <w:rFonts w:ascii="Times New Roman" w:hAnsi="Times New Roman"/>
-                <w:sz w:val="26"/>
-                <w:szCs w:val="26"/>
+                <w:szCs w:val="28"/>
+                <w:lang w:val="vi-VN"/>
               </w:rPr>
             </w:pPr>
             <w:r>
               <w:rPr>
                 <w:rFonts w:ascii="Times New Roman" w:hAnsi="Times New Roman"/>
-                <w:sz w:val="26"/>
-                <w:szCs w:val="26"/>
-              </w:rPr>
-              <w:t xml:space="preserve">TẬP </w:t>
-            </w:r>
-            <w:r>
-              <w:rPr>
-                <w:rFonts w:ascii="Times New Roman" w:hAnsi="Times New Roman" w:hint="eastAsia"/>
-                <w:sz w:val="26"/>
-                <w:szCs w:val="26"/>
-              </w:rPr>
-              <w:t>Đ</w:t>
-            </w:r>
-            <w:r>
-              <w:rPr>
-                <w:rFonts w:ascii="Times New Roman" w:hAnsi="Times New Roman"/>
-                <w:sz w:val="26"/>
-                <w:szCs w:val="26"/>
-              </w:rPr>
-              <w:t>OÀN</w:t>
+                <w:szCs w:val="28"/>
+              </w:rPr>
+              <w:t xml:space="preserve">VIỄN THÔNG </w:t>
+            </w:r>
+            <w:r>
+              <w:rPr>
+                <w:rFonts w:ascii="Times New Roman" w:hAnsi="Times New Roman"/>
+                <w:szCs w:val="28"/>
+              </w:rPr>
+              <w:t>TÂY NINH</w:t>
             </w:r>
           </w:p>
           <w:p>
@@ -145,56 +91,10 @@
               <w:jc w:val="center"/>
               <w:rPr>
                 <w:rFonts w:ascii="Times New Roman" w:hAnsi="Times New Roman"/>
-                <w:bCs/>
-                <w:sz w:val="26"/>
-                <w:szCs w:val="26"/>
-              </w:rPr>
-            </w:pPr>
-            <w:r>
-              <w:rPr>
-                <w:rFonts w:ascii="Times New Roman" w:hAnsi="Times New Roman"/>
-                <w:sz w:val="26"/>
-                <w:szCs w:val="26"/>
-              </w:rPr>
-              <w:t xml:space="preserve"> B</w:t>
-            </w:r>
-            <w:r>
-              <w:rPr>
-                <w:rFonts w:ascii="Times New Roman" w:hAnsi="Times New Roman" w:hint="eastAsia"/>
-                <w:sz w:val="26"/>
-                <w:szCs w:val="26"/>
-              </w:rPr>
-              <w:t>Ư</w:t>
-            </w:r>
-            <w:r>
-              <w:rPr>
-                <w:rFonts w:ascii="Times New Roman" w:hAnsi="Times New Roman"/>
-                <w:sz w:val="26"/>
-                <w:szCs w:val="26"/>
-              </w:rPr>
-              <w:t xml:space="preserve">U CHÍNH VIỄN THÔNG VIỆT </w:t>
-            </w:r>
-            <w:smartTag w:uri="urn:schemas-microsoft-com:office:smarttags" w:element="place">
-              <w:smartTag w:uri="urn:schemas-microsoft-com:office:smarttags" w:element="country-region">
-                <w:r>
-                  <w:rPr>
-                    <w:rFonts w:ascii="Times New Roman" w:hAnsi="Times New Roman"/>
-                    <w:sz w:val="26"/>
-                    <w:szCs w:val="26"/>
-                  </w:rPr>
-                  <w:t>NAM</w:t>
-                </w:r>
-              </w:smartTag>
-            </w:smartTag>
-          </w:p>
-          <w:p>
-            <w:pPr>
-              <w:jc w:val="center"/>
-              <w:rPr>
-                <w:rFonts w:ascii="Times New Roman" w:hAnsi="Times New Roman"/>
                 <w:b/>
                 <w:sz w:val="24"/>
                 <w:szCs w:val="24"/>
+                <w:lang w:val="vi-VN"/>
               </w:rPr>
             </w:pPr>
             <w:r>
@@ -203,17 +103,9 @@
                 <w:b/>
                 <w:bCs/>
                 <w:szCs w:val="28"/>
-              </w:rPr>
-              <w:t xml:space="preserve">VIỄN THÔNG </w:t>
-            </w:r>
-            <w:r>
-              <w:rPr>
-                <w:rFonts w:ascii="Times New Roman" w:hAnsi="Times New Roman"/>
-                <w:b/>
-                <w:bCs/>
-                <w:szCs w:val="28"/>
-              </w:rPr>
-              <w:t>TÂY NINH</w:t>
+                <w:lang w:val="vi-VN"/>
+              </w:rPr>
+              <w:t xml:space="preserve">TRUNG TÂM HẠ TẦNG </w:t>
             </w:r>
           </w:p>
           <w:p>
@@ -327,8 +219,8 @@
               </w:rPr>
               <w:t xml:space="preserve">CỘNG HOÀ XÃ HỘI CHỦ NGHĨA VIỆT </w:t>
             </w:r>
-            <w:smartTag w:uri="urn:schemas-microsoft-com:office:smarttags" w:element="place">
-              <w:smartTag w:uri="urn:schemas-microsoft-com:office:smarttags" w:element="country-region">
+            <w:smartTag w:uri="urn:schemas-microsoft-com:office:smarttags" w:element="country-region">
+              <w:smartTag w:uri="urn:schemas-microsoft-com:office:smarttags" w:element="place">
                 <w:r>
                   <w:rPr>
                     <w:rFonts w:ascii="Times New Roman" w:hAnsi="Times New Roman"/>
@@ -349,6 +241,7 @@
                 <w:szCs w:val="28"/>
               </w:rPr>
             </w:pPr>
+            <w:proofErr w:type="spellStart"/>
             <w:r>
               <w:rPr>
                 <w:rFonts w:ascii="Times New Roman" w:hAnsi="Times New Roman" w:hint="eastAsia"/>
@@ -363,8 +256,81 @@
                 <w:b/>
                 <w:szCs w:val="28"/>
               </w:rPr>
-              <w:t>ộc lập - Tự do - Hạnh phúc</w:t>
-            </w:r>
+              <w:t>ộc</w:t>
+            </w:r>
+            <w:proofErr w:type="spellEnd"/>
+            <w:r>
+              <w:rPr>
+                <w:rFonts w:ascii="Times New Roman" w:hAnsi="Times New Roman"/>
+                <w:b/>
+                <w:szCs w:val="28"/>
+              </w:rPr>
+              <w:t xml:space="preserve"> </w:t>
+            </w:r>
+            <w:proofErr w:type="spellStart"/>
+            <w:r>
+              <w:rPr>
+                <w:rFonts w:ascii="Times New Roman" w:hAnsi="Times New Roman"/>
+                <w:b/>
+                <w:szCs w:val="28"/>
+              </w:rPr>
+              <w:t>lập</w:t>
+            </w:r>
+            <w:proofErr w:type="spellEnd"/>
+            <w:r>
+              <w:rPr>
+                <w:rFonts w:ascii="Times New Roman" w:hAnsi="Times New Roman"/>
+                <w:b/>
+                <w:szCs w:val="28"/>
+              </w:rPr>
+              <w:t xml:space="preserve"> - </w:t>
+            </w:r>
+            <w:proofErr w:type="spellStart"/>
+            <w:r>
+              <w:rPr>
+                <w:rFonts w:ascii="Times New Roman" w:hAnsi="Times New Roman"/>
+                <w:b/>
+                <w:szCs w:val="28"/>
+              </w:rPr>
+              <w:t>Tự</w:t>
+            </w:r>
+            <w:proofErr w:type="spellEnd"/>
+            <w:r>
+              <w:rPr>
+                <w:rFonts w:ascii="Times New Roman" w:hAnsi="Times New Roman"/>
+                <w:b/>
+                <w:szCs w:val="28"/>
+              </w:rPr>
+              <w:t xml:space="preserve"> do - </w:t>
+            </w:r>
+            <w:proofErr w:type="spellStart"/>
+            <w:r>
+              <w:rPr>
+                <w:rFonts w:ascii="Times New Roman" w:hAnsi="Times New Roman"/>
+                <w:b/>
+                <w:szCs w:val="28"/>
+              </w:rPr>
+              <w:t>Hạnh</w:t>
+            </w:r>
+            <w:proofErr w:type="spellEnd"/>
+            <w:r>
+              <w:rPr>
+                <w:rFonts w:ascii="Times New Roman" w:hAnsi="Times New Roman"/>
+                <w:b/>
+                <w:szCs w:val="28"/>
+              </w:rPr>
+              <w:t xml:space="preserve"> </w:t>
+            </w:r>
+            <w:proofErr w:type="spellStart"/>
+            <w:r>
+              <w:rPr>
+                <w:rFonts w:ascii="Times New Roman" w:hAnsi="Times New Roman"/>
+                <w:b/>
+                <w:szCs w:val="28"/>
+              </w:rPr>
+              <w:t>phúc</w:t>
+            </w:r>
+            <w:proofErr w:type="spellEnd"/>
           </w:p>
           <w:p>
             <w:pPr>
@@ -456,7 +422,18 @@
         </w:tc>
       </w:tr>
       <w:tr>
+        <w:tblPrEx>
+          <w:tblBorders>
+            <w:bottom w:val="none" w:sz="0" w:space="0" w:color="auto"/>
+          </w:tblBorders>
+          <w:tblCellMar>
+            <w:left w:w="85" w:type="dxa"/>
+            <w:right w:w="85" w:type="dxa"/>
+          </w:tblCellMar>
+        </w:tblPrEx>
         <w:trPr>
+          <w:gridAfter w:val="1"/>
+          <w:wAfter w:w="9" w:type="dxa"/>
           <w:cantSplit/>
         </w:trPr>
         <w:tc>
@@ -480,12 +457,21 @@
               </w:rPr>
               <w:t xml:space="preserve">     </w:t>
             </w:r>
-            <w:r>
-              <w:rPr>
-                <w:rFonts w:ascii="Times New Roman" w:hAnsi="Times New Roman"/>
-                <w:szCs w:val="28"/>
-              </w:rPr>
-              <w:t xml:space="preserve">Số:          </w:t>
+            <w:proofErr w:type="spellStart"/>
+            <w:r>
+              <w:rPr>
+                <w:rFonts w:ascii="Times New Roman" w:hAnsi="Times New Roman"/>
+                <w:szCs w:val="28"/>
+              </w:rPr>
+              <w:t>Số</w:t>
+            </w:r>
+            <w:proofErr w:type="spellEnd"/>
+            <w:r>
+              <w:rPr>
+                <w:rFonts w:ascii="Times New Roman" w:hAnsi="Times New Roman"/>
+                <w:szCs w:val="28"/>
+              </w:rPr>
+              <w:t xml:space="preserve">:          </w:t>
             </w:r>
           </w:p>
         </w:tc>
@@ -522,20 +508,48 @@
               </w:rPr>
               <w:t xml:space="preserve">, </w:t>
             </w:r>
+            <w:proofErr w:type="spellStart"/>
             <w:r>
               <w:rPr>
                 <w:rFonts w:ascii="Times New Roman" w:hAnsi="Times New Roman"/>
                 <w:i/>
                 <w:szCs w:val="28"/>
               </w:rPr>
-              <w:t xml:space="preserve">ngày        tháng   </w:t>
-            </w:r>
+              <w:t>ngày</w:t>
+            </w:r>
+            <w:proofErr w:type="spellEnd"/>
             <w:r>
               <w:rPr>
                 <w:rFonts w:ascii="Times New Roman" w:hAnsi="Times New Roman"/>
                 <w:i/>
                 <w:szCs w:val="28"/>
               </w:rPr>
+              <w:t xml:space="preserve">        </w:t>
+            </w:r>
+            <w:proofErr w:type="spellStart"/>
+            <w:r>
+              <w:rPr>
+                <w:rFonts w:ascii="Times New Roman" w:hAnsi="Times New Roman"/>
+                <w:i/>
+                <w:szCs w:val="28"/>
+              </w:rPr>
+              <w:t>tháng</w:t>
+            </w:r>
+            <w:proofErr w:type="spellEnd"/>
+            <w:r>
+              <w:rPr>
+                <w:rFonts w:ascii="Times New Roman" w:hAnsi="Times New Roman"/>
+                <w:i/>
+                <w:szCs w:val="28"/>
+              </w:rPr>
+              <w:t xml:space="preserve">   </w:t>
+            </w:r>
+            <w:r>
+              <w:rPr>
+                <w:rFonts w:ascii="Times New Roman" w:hAnsi="Times New Roman"/>
+                <w:i/>
+                <w:szCs w:val="28"/>
+              </w:rPr>
               <w:t xml:space="preserve"> </w:t>
             </w:r>
             <w:r>
@@ -544,7 +558,16 @@
                 <w:i/>
                 <w:szCs w:val="28"/>
               </w:rPr>
-              <w:t xml:space="preserve">   n</w:t>
+              <w:t xml:space="preserve">   </w:t>
+            </w:r>
+            <w:proofErr w:type="spellStart"/>
+            <w:r>
+              <w:rPr>
+                <w:rFonts w:ascii="Times New Roman" w:hAnsi="Times New Roman"/>
+                <w:i/>
+                <w:szCs w:val="28"/>
+              </w:rPr>
+              <w:t>n</w:t>
             </w:r>
             <w:r>
               <w:rPr>
@@ -560,7 +583,16 @@
                 <w:i/>
                 <w:szCs w:val="28"/>
               </w:rPr>
-              <w:t xml:space="preserve">m  </w:t>
+              <w:t>m</w:t>
+            </w:r>
+            <w:proofErr w:type="spellEnd"/>
+            <w:r>
+              <w:rPr>
+                <w:rFonts w:ascii="Times New Roman" w:hAnsi="Times New Roman"/>
+                <w:i/>
+                <w:szCs w:val="28"/>
+              </w:rPr>
+              <w:t xml:space="preserve">  </w:t>
             </w:r>
           </w:p>
         </w:tc>
@@ -610,11 +642,19 @@
           <w:rFonts w:ascii="Times New Roman" w:hAnsi="Times New Roman"/>
         </w:rPr>
       </w:pPr>
+      <w:proofErr w:type="spellStart"/>
       <w:r>
         <w:rPr>
           <w:rFonts w:ascii="Times New Roman" w:hAnsi="Times New Roman"/>
         </w:rPr>
-        <w:t xml:space="preserve">Về ........………...... </w:t>
+        <w:t>Về</w:t>
+      </w:r>
+      <w:proofErr w:type="spellEnd"/>
+      <w:r>
+        <w:rPr>
+          <w:rFonts w:ascii="Times New Roman" w:hAnsi="Times New Roman"/>
+        </w:rPr>
+        <w:t xml:space="preserve"> ........………...... </w:t>
       </w:r>
       <w:r>
         <w:rPr>
@@ -977,8 +1017,7 @@
     </w:p>
     <w:tbl>
       <w:tblPr>
-        <w:tblW w:w="9486" w:type="dxa"/>
-        <w:tblInd w:w="-52" w:type="dxa"/>
+        <w:tblW w:w="9434" w:type="dxa"/>
         <w:tblLayout w:type="fixed"/>
         <w:tblCellMar>
           <w:left w:w="56" w:type="dxa"/>
@@ -987,15 +1026,11 @@
         <w:tblLook w:val="0000" w:firstRow="0" w:lastRow="0" w:firstColumn="0" w:lastColumn="0" w:noHBand="0" w:noVBand="0"/>
       </w:tblPr>
       <w:tblGrid>
-        <w:gridCol w:w="52"/>
         <w:gridCol w:w="3643"/>
-        <w:gridCol w:w="5717"/>
-        <w:gridCol w:w="74"/>
+        <w:gridCol w:w="5791"/>
       </w:tblGrid>
       <w:tr>
         <w:trPr>
-          <w:gridBefore w:val="1"/>
-          <w:wBefore w:w="52" w:type="dxa"/>
           <w:trHeight w:val="2079"/>
         </w:trPr>
         <w:tc>
@@ -1011,6 +1046,7 @@
                 <w:sz w:val="24"/>
               </w:rPr>
             </w:pPr>
+            <w:proofErr w:type="spellStart"/>
             <w:r>
               <w:rPr>
                 <w:rFonts w:ascii="Times New Roman" w:hAnsi="Times New Roman"/>
@@ -1036,7 +1072,37 @@
                 <w:i/>
                 <w:sz w:val="24"/>
               </w:rPr>
-              <w:t>i nhận:</w:t>
+              <w:t>i</w:t>
+            </w:r>
+            <w:proofErr w:type="spellEnd"/>
+            <w:r>
+              <w:rPr>
+                <w:rFonts w:ascii="Times New Roman" w:hAnsi="Times New Roman"/>
+                <w:b/>
+                <w:i/>
+                <w:sz w:val="24"/>
+              </w:rPr>
+              <w:t xml:space="preserve"> </w:t>
+            </w:r>
+            <w:proofErr w:type="spellStart"/>
+            <w:r>
+              <w:rPr>
+                <w:rFonts w:ascii="Times New Roman" w:hAnsi="Times New Roman"/>
+                <w:b/>
+                <w:i/>
+                <w:sz w:val="24"/>
+              </w:rPr>
+              <w:t>nhận</w:t>
+            </w:r>
+            <w:proofErr w:type="spellEnd"/>
+            <w:r>
+              <w:rPr>
+                <w:rFonts w:ascii="Times New Roman" w:hAnsi="Times New Roman"/>
+                <w:b/>
+                <w:i/>
+                <w:sz w:val="24"/>
+              </w:rPr>
+              <w:t>:</w:t>
             </w:r>
           </w:p>
           <w:p>
@@ -1095,7 +1161,15 @@
                 <w:rFonts w:ascii="Times New Roman" w:hAnsi="Times New Roman"/>
                 <w:sz w:val="22"/>
               </w:rPr>
-              <w:t>u: VT, ...</w:t>
+              <w:t xml:space="preserve">u: VT, </w:t>
+            </w:r>
+            <w:proofErr w:type="gramStart"/>
+            <w:r>
+              <w:rPr>
+                <w:rFonts w:ascii="Times New Roman" w:hAnsi="Times New Roman"/>
+                <w:sz w:val="22"/>
+              </w:rPr>
+              <w:t>...</w:t>
             </w:r>
             <w:r>
               <w:rPr>
@@ -1104,6 +1178,7 @@
               </w:rPr>
               <w:t>(</w:t>
             </w:r>
+            <w:proofErr w:type="gramEnd"/>
             <w:r>
               <w:rPr>
                 <w:rFonts w:ascii="Times New Roman" w:hAnsi="Times New Roman"/>
@@ -1132,6 +1207,7 @@
               </w:rPr>
               <w:t xml:space="preserve"> </w:t>
             </w:r>
+            <w:proofErr w:type="gramStart"/>
             <w:r>
               <w:rPr>
                 <w:rFonts w:ascii="Times New Roman" w:hAnsi="Times New Roman"/>
@@ -1139,6 +1215,7 @@
               </w:rPr>
               <w:t>XX(</w:t>
             </w:r>
+            <w:proofErr w:type="gramEnd"/>
             <w:r>
               <w:rPr>
                 <w:rFonts w:ascii="Times New Roman" w:hAnsi="Times New Roman"/>
@@ -1169,6 +1246,7 @@
                 <w:sz w:val="22"/>
               </w:rPr>
             </w:pPr>
+            <w:proofErr w:type="spellStart"/>
             <w:r>
               <w:rPr>
                 <w:rFonts w:ascii="Times New Roman" w:hAnsi="Times New Roman"/>
@@ -1176,8 +1254,9 @@
                 <w:bCs/>
                 <w:sz w:val="24"/>
               </w:rPr>
-              <w:t>Số eOffice: ..(</w:t>
-            </w:r>
+              <w:t>Số</w:t>
+            </w:r>
+            <w:proofErr w:type="spellEnd"/>
             <w:r>
               <w:rPr>
                 <w:rFonts w:ascii="Times New Roman" w:hAnsi="Times New Roman"/>
@@ -1185,8 +1264,10 @@
                 <w:bCs/>
                 <w:sz w:val="24"/>
               </w:rPr>
-              <w:t>8</w:t>
-            </w:r>
+              <w:t xml:space="preserve"> </w:t>
+            </w:r>
+            <w:proofErr w:type="spellStart"/>
+            <w:proofErr w:type="gramStart"/>
             <w:r>
               <w:rPr>
                 <w:rFonts w:ascii="Times New Roman" w:hAnsi="Times New Roman"/>
@@ -1194,7 +1275,56 @@
                 <w:bCs/>
                 <w:sz w:val="24"/>
               </w:rPr>
-              <w:t>)..-</w:t>
+              <w:t>eOffice</w:t>
+            </w:r>
+            <w:proofErr w:type="spellEnd"/>
+            <w:r>
+              <w:rPr>
+                <w:rFonts w:ascii="Times New Roman" w:hAnsi="Times New Roman"/>
+                <w:b/>
+                <w:bCs/>
+                <w:sz w:val="24"/>
+              </w:rPr>
+              <w:t>: ..</w:t>
+            </w:r>
+            <w:proofErr w:type="gramEnd"/>
+            <w:r>
+              <w:rPr>
+                <w:rFonts w:ascii="Times New Roman" w:hAnsi="Times New Roman"/>
+                <w:b/>
+                <w:bCs/>
+                <w:sz w:val="24"/>
+              </w:rPr>
+              <w:t>(</w:t>
+            </w:r>
+            <w:r>
+              <w:rPr>
+                <w:rFonts w:ascii="Times New Roman" w:hAnsi="Times New Roman"/>
+                <w:b/>
+                <w:bCs/>
+                <w:sz w:val="24"/>
+              </w:rPr>
+              <w:t>8</w:t>
+            </w:r>
+            <w:proofErr w:type="gramStart"/>
+            <w:r>
+              <w:rPr>
+                <w:rFonts w:ascii="Times New Roman" w:hAnsi="Times New Roman"/>
+                <w:b/>
+                <w:bCs/>
+                <w:sz w:val="24"/>
+              </w:rPr>
+              <w:t>)..</w:t>
+            </w:r>
+            <w:proofErr w:type="gramEnd"/>
+            <w:r>
+              <w:rPr>
+                <w:rFonts w:ascii="Times New Roman" w:hAnsi="Times New Roman"/>
+                <w:b/>
+                <w:bCs/>
+                <w:sz w:val="24"/>
+              </w:rPr>
+              <w:t>-</w:t>
             </w:r>
             <w:r>
               <w:rPr>
@@ -1219,7 +1349,6 @@
         <w:tc>
           <w:tcPr>
             <w:tcW w:w="5791" w:type="dxa"/>
-            <w:gridSpan w:val="2"/>
           </w:tcPr>
           <w:p>
             <w:pPr>
@@ -1296,7 +1425,55 @@
                 <w:rFonts w:ascii="Times New Roman" w:hAnsi="Times New Roman"/>
                 <w:i/>
               </w:rPr>
-              <w:t>(Chữ ký, dấu)</w:t>
+              <w:t>(</w:t>
+            </w:r>
+            <w:proofErr w:type="spellStart"/>
+            <w:r>
+              <w:rPr>
+                <w:rFonts w:ascii="Times New Roman" w:hAnsi="Times New Roman"/>
+                <w:i/>
+              </w:rPr>
+              <w:t>Chữ</w:t>
+            </w:r>
+            <w:proofErr w:type="spellEnd"/>
+            <w:r>
+              <w:rPr>
+                <w:rFonts w:ascii="Times New Roman" w:hAnsi="Times New Roman"/>
+                <w:i/>
+              </w:rPr>
+              <w:t xml:space="preserve"> </w:t>
+            </w:r>
+            <w:proofErr w:type="spellStart"/>
+            <w:r>
+              <w:rPr>
+                <w:rFonts w:ascii="Times New Roman" w:hAnsi="Times New Roman"/>
+                <w:i/>
+              </w:rPr>
+              <w:t>ký</w:t>
+            </w:r>
+            <w:proofErr w:type="spellEnd"/>
+            <w:r>
+              <w:rPr>
+                <w:rFonts w:ascii="Times New Roman" w:hAnsi="Times New Roman"/>
+                <w:i/>
+              </w:rPr>
+              <w:t xml:space="preserve">, </w:t>
+            </w:r>
+            <w:proofErr w:type="spellStart"/>
+            <w:r>
+              <w:rPr>
+                <w:rFonts w:ascii="Times New Roman" w:hAnsi="Times New Roman"/>
+                <w:i/>
+              </w:rPr>
+              <w:t>dấu</w:t>
+            </w:r>
+            <w:proofErr w:type="spellEnd"/>
+            <w:r>
+              <w:rPr>
+                <w:rFonts w:ascii="Times New Roman" w:hAnsi="Times New Roman"/>
+                <w:i/>
+              </w:rPr>
+              <w:t>)</w:t>
             </w:r>
           </w:p>
           <w:p>
@@ -1328,630 +1505,52 @@
                 <w:szCs w:val="24"/>
               </w:rPr>
             </w:pPr>
-            <w:r>
-              <w:rPr>
-                <w:rFonts w:ascii="Times New Roman" w:hAnsi="Times New Roman"/>
-                <w:b/>
-                <w:szCs w:val="28"/>
-              </w:rPr>
-              <w:t>Họ Và Tên</w:t>
-            </w:r>
-          </w:p>
-        </w:tc>
-      </w:tr>
-      <w:tr>
-        <w:tblPrEx>
-          <w:tblBorders>
-            <w:top w:val="single" w:sz="8" w:space="0" w:color="auto"/>
-          </w:tblBorders>
-          <w:tblCellMar>
-            <w:left w:w="108" w:type="dxa"/>
-            <w:right w:w="108" w:type="dxa"/>
-          </w:tblCellMar>
-        </w:tblPrEx>
-        <w:trPr>
-          <w:gridAfter w:val="1"/>
-          <w:wAfter w:w="74" w:type="dxa"/>
-          <w:trHeight w:val="2532"/>
-        </w:trPr>
-        <w:tc>
-          <w:tcPr>
-            <w:tcW w:w="9412" w:type="dxa"/>
-            <w:gridSpan w:val="3"/>
-            <w:tcBorders>
-              <w:top w:val="single" w:sz="4" w:space="0" w:color="auto"/>
-            </w:tcBorders>
-          </w:tcPr>
-          <w:p>
-            <w:pPr>
-              <w:jc w:val="both"/>
-              <w:rPr>
-                <w:rFonts w:ascii="Times New Roman" w:hAnsi="Times New Roman"/>
-                <w:b/>
-                <w:i/>
-                <w:sz w:val="22"/>
-              </w:rPr>
-            </w:pPr>
-            <w:r>
-              <w:rPr>
-                <w:rFonts w:ascii="Times New Roman" w:hAnsi="Times New Roman"/>
-                <w:b/>
-                <w:i/>
-                <w:sz w:val="22"/>
-              </w:rPr>
-              <w:t>Ghi chú:</w:t>
-            </w:r>
-          </w:p>
-          <w:p>
-            <w:pPr>
-              <w:rPr>
-                <w:rFonts w:ascii="Times New Roman" w:hAnsi="Times New Roman"/>
-                <w:b/>
-                <w:bCs/>
-                <w:i/>
-                <w:iCs/>
-                <w:sz w:val="22"/>
-                <w:szCs w:val="22"/>
-                <w:lang w:val="en-GB" w:eastAsia="zh-CN"/>
-              </w:rPr>
-            </w:pPr>
-            <w:r>
-              <w:rPr>
-                <w:rFonts w:ascii="Times New Roman" w:hAnsi="Times New Roman"/>
-                <w:b/>
-                <w:bCs/>
-                <w:i/>
-                <w:iCs/>
-                <w:sz w:val="22"/>
-                <w:szCs w:val="22"/>
-                <w:lang w:val="en-GB" w:eastAsia="zh-CN"/>
-              </w:rPr>
-              <w:t>* Các phần ghi: số: ký hiệu, ngày, tháng, năm của văn bản (để trống</w:t>
-            </w:r>
-            <w:r>
-              <w:rPr>
-                <w:rFonts w:ascii="Times New Roman" w:hAnsi="Times New Roman"/>
-                <w:b/>
-                <w:bCs/>
-                <w:i/>
-                <w:iCs/>
-                <w:sz w:val="22"/>
-                <w:szCs w:val="22"/>
-                <w:lang w:val="en-GB" w:eastAsia="zh-CN"/>
-              </w:rPr>
-              <w:t xml:space="preserve"> để hệ thống tự cập nhật</w:t>
-            </w:r>
-            <w:r>
-              <w:rPr>
-                <w:rFonts w:ascii="Times New Roman" w:hAnsi="Times New Roman"/>
-                <w:b/>
-                <w:bCs/>
-                <w:i/>
-                <w:iCs/>
-                <w:sz w:val="22"/>
-                <w:szCs w:val="22"/>
-                <w:lang w:val="en-GB" w:eastAsia="zh-CN"/>
-              </w:rPr>
-              <w:t>).</w:t>
-            </w:r>
-          </w:p>
-          <w:p>
-            <w:pPr>
-              <w:jc w:val="both"/>
-              <w:rPr>
-                <w:rFonts w:ascii="Times New Roman" w:hAnsi="Times New Roman"/>
-                <w:b/>
-                <w:bCs/>
-                <w:i/>
-                <w:iCs/>
-                <w:sz w:val="22"/>
-                <w:lang w:val="en-GB"/>
-              </w:rPr>
-            </w:pPr>
-            <w:r>
-              <w:rPr>
-                <w:rFonts w:ascii="Times New Roman" w:hAnsi="Times New Roman"/>
-                <w:b/>
-                <w:bCs/>
-                <w:i/>
-                <w:iCs/>
-                <w:sz w:val="22"/>
-                <w:szCs w:val="22"/>
-                <w:lang w:val="en-GB" w:eastAsia="zh-CN"/>
-              </w:rPr>
-              <w:t xml:space="preserve">* Phần đề ký: để khoảng cách (thông thủy) </w:t>
-            </w:r>
-            <w:r>
-              <w:rPr>
-                <w:rFonts w:ascii="Times New Roman" w:hAnsi="Times New Roman"/>
-                <w:b/>
-                <w:bCs/>
-                <w:i/>
-                <w:iCs/>
-                <w:sz w:val="22"/>
-                <w:lang w:val="en-GB"/>
-              </w:rPr>
-              <w:t>từ chân dòng ghi chức vụ bên trên đến dòng ghi họ và tên của người ký văn bản bên dưới từ 4,5cm đến 5 cm)</w:t>
-            </w:r>
-          </w:p>
-          <w:p>
-            <w:pPr>
-              <w:jc w:val="both"/>
-              <w:rPr>
-                <w:rFonts w:ascii="Times New Roman" w:hAnsi="Times New Roman"/>
-                <w:sz w:val="20"/>
-              </w:rPr>
-            </w:pPr>
-            <w:r>
-              <w:rPr>
-                <w:rFonts w:ascii="Times New Roman" w:hAnsi="Times New Roman"/>
-                <w:sz w:val="20"/>
-              </w:rPr>
-              <w:t>(1) Tên đơn vị ban hành văn bản (chữ in hoa, đứng, đậm)</w:t>
-            </w:r>
-            <w:r>
-              <w:rPr>
-                <w:rFonts w:ascii="Times New Roman" w:hAnsi="Times New Roman"/>
-                <w:sz w:val="20"/>
+            <w:proofErr w:type="spellStart"/>
+            <w:r>
+              <w:rPr>
+                <w:rFonts w:ascii="Times New Roman" w:hAnsi="Times New Roman"/>
+                <w:b/>
+                <w:szCs w:val="28"/>
+              </w:rPr>
+              <w:t>Họ</w:t>
+            </w:r>
+            <w:proofErr w:type="spellEnd"/>
+            <w:r>
+              <w:rPr>
+                <w:rFonts w:ascii="Times New Roman" w:hAnsi="Times New Roman"/>
+                <w:b/>
+                <w:szCs w:val="28"/>
               </w:rPr>
               <w:t xml:space="preserve"> </w:t>
             </w:r>
-          </w:p>
-          <w:p>
-            <w:pPr>
-              <w:jc w:val="both"/>
-              <w:rPr>
-                <w:rFonts w:ascii="Times New Roman" w:hAnsi="Times New Roman"/>
-                <w:sz w:val="20"/>
-              </w:rPr>
-            </w:pPr>
-            <w:r>
-              <w:rPr>
-                <w:rFonts w:ascii="Times New Roman" w:hAnsi="Times New Roman"/>
-                <w:sz w:val="20"/>
-              </w:rPr>
-              <w:t>(</w:t>
-            </w:r>
-            <w:r>
-              <w:rPr>
-                <w:rFonts w:ascii="Times New Roman" w:hAnsi="Times New Roman"/>
-                <w:sz w:val="20"/>
-              </w:rPr>
-              <w:t>2</w:t>
-            </w:r>
-            <w:r>
-              <w:rPr>
-                <w:rFonts w:ascii="Times New Roman" w:hAnsi="Times New Roman"/>
-                <w:sz w:val="20"/>
-              </w:rPr>
-              <w:t xml:space="preserve">) </w:t>
-            </w:r>
-            <w:r>
-              <w:rPr>
-                <w:rFonts w:ascii="Times New Roman" w:hAnsi="Times New Roman"/>
-                <w:sz w:val="20"/>
-              </w:rPr>
-              <w:t>Ghi đ</w:t>
-            </w:r>
-            <w:r>
-              <w:rPr>
-                <w:rFonts w:ascii="Times New Roman" w:hAnsi="Times New Roman"/>
-                <w:sz w:val="20"/>
-              </w:rPr>
-              <w:t>ịa danh.</w:t>
-            </w:r>
-          </w:p>
-          <w:p>
-            <w:pPr>
-              <w:jc w:val="both"/>
-              <w:rPr>
-                <w:rFonts w:ascii="Times New Roman" w:hAnsi="Times New Roman"/>
-                <w:sz w:val="20"/>
-              </w:rPr>
-            </w:pPr>
-            <w:r>
-              <w:rPr>
-                <w:rFonts w:ascii="Times New Roman" w:hAnsi="Times New Roman"/>
-                <w:sz w:val="20"/>
-              </w:rPr>
-              <w:t>(</w:t>
-            </w:r>
-            <w:r>
-              <w:rPr>
-                <w:rFonts w:ascii="Times New Roman" w:hAnsi="Times New Roman"/>
-                <w:sz w:val="20"/>
-              </w:rPr>
-              <w:t>3</w:t>
-            </w:r>
-            <w:r>
-              <w:rPr>
-                <w:rFonts w:ascii="Times New Roman" w:hAnsi="Times New Roman"/>
-                <w:sz w:val="20"/>
-              </w:rPr>
-              <w:t>) Trích yếu nội dung chỉ thị (chữ thường, đứng, đậm).</w:t>
-            </w:r>
-          </w:p>
-          <w:p>
-            <w:pPr>
-              <w:jc w:val="both"/>
-              <w:rPr>
-                <w:rFonts w:ascii="Times New Roman" w:hAnsi="Times New Roman"/>
-                <w:sz w:val="20"/>
-              </w:rPr>
-            </w:pPr>
-            <w:r>
-              <w:rPr>
-                <w:rFonts w:ascii="Times New Roman" w:hAnsi="Times New Roman"/>
-                <w:sz w:val="20"/>
-              </w:rPr>
-              <w:t>(</w:t>
-            </w:r>
-            <w:r>
-              <w:rPr>
-                <w:rFonts w:ascii="Times New Roman" w:hAnsi="Times New Roman"/>
-                <w:sz w:val="20"/>
-              </w:rPr>
-              <w:t>4</w:t>
-            </w:r>
-            <w:r>
-              <w:rPr>
-                <w:rFonts w:ascii="Times New Roman" w:hAnsi="Times New Roman"/>
-                <w:sz w:val="20"/>
-              </w:rPr>
-              <w:t>) Nội dung v</w:t>
-            </w:r>
-            <w:r>
-              <w:rPr>
-                <w:rFonts w:ascii="Times New Roman" w:hAnsi="Times New Roman" w:hint="eastAsia"/>
-                <w:sz w:val="20"/>
-              </w:rPr>
-              <w:t>ă</w:t>
-            </w:r>
-            <w:r>
-              <w:rPr>
-                <w:rFonts w:ascii="Times New Roman" w:hAnsi="Times New Roman"/>
-                <w:sz w:val="20"/>
-              </w:rPr>
-              <w:t>n bản.</w:t>
-            </w:r>
-          </w:p>
-          <w:p>
-            <w:pPr>
-              <w:jc w:val="both"/>
-              <w:rPr>
-                <w:rFonts w:ascii="Times New Roman" w:hAnsi="Times New Roman"/>
-                <w:sz w:val="20"/>
-              </w:rPr>
-            </w:pPr>
-            <w:r>
-              <w:rPr>
-                <w:rFonts w:ascii="Times New Roman" w:hAnsi="Times New Roman"/>
-                <w:sz w:val="20"/>
-              </w:rPr>
-              <w:t>(</w:t>
-            </w:r>
-            <w:r>
-              <w:rPr>
-                <w:rFonts w:ascii="Times New Roman" w:hAnsi="Times New Roman"/>
-                <w:sz w:val="20"/>
-              </w:rPr>
-              <w:t>5</w:t>
-            </w:r>
-            <w:r>
-              <w:rPr>
-                <w:rFonts w:ascii="Times New Roman" w:hAnsi="Times New Roman"/>
-                <w:sz w:val="20"/>
-              </w:rPr>
-              <w:t>) Ghi quyền hạn, chức vụ của ng</w:t>
-            </w:r>
-            <w:r>
-              <w:rPr>
-                <w:rFonts w:ascii="Times New Roman" w:hAnsi="Times New Roman" w:hint="eastAsia"/>
-                <w:sz w:val="20"/>
-              </w:rPr>
-              <w:t>ư</w:t>
-            </w:r>
-            <w:r>
-              <w:rPr>
-                <w:rFonts w:ascii="Times New Roman" w:hAnsi="Times New Roman"/>
-                <w:sz w:val="20"/>
-              </w:rPr>
-              <w:t>ời ký v</w:t>
-            </w:r>
-            <w:r>
-              <w:rPr>
-                <w:rFonts w:ascii="Times New Roman" w:hAnsi="Times New Roman" w:hint="eastAsia"/>
-                <w:sz w:val="20"/>
-              </w:rPr>
-              <w:t>ă</w:t>
-            </w:r>
-            <w:r>
-              <w:rPr>
-                <w:rFonts w:ascii="Times New Roman" w:hAnsi="Times New Roman"/>
-                <w:sz w:val="20"/>
-              </w:rPr>
-              <w:t>n bản (chữ in hoa, đứng đậm).</w:t>
-            </w:r>
-          </w:p>
-          <w:p>
-            <w:pPr>
-              <w:pStyle w:val="BodyTextIndent"/>
-              <w:spacing w:after="0"/>
-              <w:ind w:firstLine="0"/>
-              <w:rPr>
-                <w:rFonts w:ascii="Times New Roman" w:hAnsi="Times New Roman"/>
-                <w:b/>
-                <w:sz w:val="20"/>
-              </w:rPr>
-            </w:pPr>
-            <w:r>
-              <w:rPr>
-                <w:rFonts w:ascii="Times New Roman" w:hAnsi="Times New Roman"/>
-                <w:sz w:val="20"/>
-              </w:rPr>
-              <w:t xml:space="preserve">Trường hợp </w:t>
-            </w:r>
-            <w:r>
-              <w:rPr>
-                <w:rFonts w:ascii="Times New Roman" w:hAnsi="Times New Roman"/>
-                <w:sz w:val="20"/>
-              </w:rPr>
-              <w:t xml:space="preserve">cấp </w:t>
-            </w:r>
-            <w:r>
-              <w:rPr>
-                <w:rFonts w:ascii="Times New Roman" w:hAnsi="Times New Roman"/>
-                <w:sz w:val="20"/>
-              </w:rPr>
-              <w:t xml:space="preserve">Phó ký thay </w:t>
-            </w:r>
-            <w:r>
-              <w:rPr>
-                <w:rFonts w:ascii="Times New Roman" w:hAnsi="Times New Roman"/>
-                <w:sz w:val="20"/>
-              </w:rPr>
-              <w:t>cấp Trưởng</w:t>
-            </w:r>
-            <w:r>
-              <w:rPr>
-                <w:rFonts w:ascii="Times New Roman" w:hAnsi="Times New Roman"/>
-                <w:sz w:val="20"/>
-              </w:rPr>
-              <w:t xml:space="preserve"> thì ghi: </w:t>
-            </w:r>
-            <w:r>
-              <w:rPr>
-                <w:rFonts w:ascii="Times New Roman" w:hAnsi="Times New Roman"/>
-                <w:sz w:val="20"/>
-              </w:rPr>
-              <w:t xml:space="preserve">       </w:t>
-            </w:r>
-            <w:r>
-              <w:rPr>
-                <w:rFonts w:ascii="Times New Roman" w:hAnsi="Times New Roman"/>
-                <w:b/>
-                <w:sz w:val="20"/>
-              </w:rPr>
-              <w:t>KT. GIÁM ĐỐC</w:t>
-            </w:r>
-          </w:p>
-          <w:p>
-            <w:pPr>
-              <w:pStyle w:val="BodyTextIndent"/>
-              <w:spacing w:after="0"/>
-              <w:ind w:firstLine="0"/>
-              <w:rPr>
-                <w:rFonts w:ascii="Times New Roman" w:hAnsi="Times New Roman"/>
-                <w:b/>
-                <w:sz w:val="20"/>
-              </w:rPr>
-            </w:pPr>
-            <w:r>
-              <w:rPr>
-                <w:rFonts w:ascii="Times New Roman" w:hAnsi="Times New Roman"/>
-                <w:b/>
-                <w:sz w:val="20"/>
-              </w:rPr>
-              <w:t xml:space="preserve">                                                                                     PHÓ GIÁM ĐỐC</w:t>
-            </w:r>
-          </w:p>
-          <w:p>
-            <w:pPr>
-              <w:jc w:val="both"/>
-              <w:rPr>
-                <w:rFonts w:ascii="Times New Roman" w:hAnsi="Times New Roman"/>
-                <w:sz w:val="20"/>
-                <w:lang w:val="en-US"/>
-              </w:rPr>
-            </w:pPr>
-            <w:r>
-              <w:rPr>
-                <w:rFonts w:ascii="Times New Roman" w:hAnsi="Times New Roman"/>
-                <w:sz w:val="20"/>
-              </w:rPr>
-              <w:t>(</w:t>
-            </w:r>
-            <w:r>
-              <w:rPr>
-                <w:rFonts w:ascii="Times New Roman" w:hAnsi="Times New Roman"/>
-                <w:sz w:val="20"/>
-              </w:rPr>
-              <w:t>6</w:t>
-            </w:r>
-            <w:r>
-              <w:rPr>
-                <w:rFonts w:ascii="Times New Roman" w:hAnsi="Times New Roman"/>
-                <w:sz w:val="20"/>
-              </w:rPr>
-              <w:t xml:space="preserve">) </w:t>
-            </w:r>
-            <w:r>
-              <w:rPr>
-                <w:rFonts w:ascii="Times New Roman" w:hAnsi="Times New Roman"/>
-                <w:sz w:val="20"/>
-                <w:lang w:val="en-US"/>
-              </w:rPr>
-              <w:t xml:space="preserve">Chữ viết tắt tên </w:t>
-            </w:r>
-            <w:r>
-              <w:rPr>
-                <w:rFonts w:ascii="Times New Roman" w:hAnsi="Times New Roman" w:hint="eastAsia"/>
-                <w:sz w:val="20"/>
-                <w:lang w:val="en-US"/>
-              </w:rPr>
-              <w:t>đơ</w:t>
-            </w:r>
-            <w:r>
-              <w:rPr>
-                <w:rFonts w:ascii="Times New Roman" w:hAnsi="Times New Roman"/>
-                <w:sz w:val="20"/>
-                <w:lang w:val="en-US"/>
-              </w:rPr>
-              <w:t xml:space="preserve">n vị chủ trì soạn thảo </w:t>
-            </w:r>
-            <w:r>
-              <w:rPr>
-                <w:rFonts w:ascii="Times New Roman" w:hAnsi="Times New Roman"/>
-                <w:spacing w:val="-2"/>
-                <w:sz w:val="20"/>
-                <w:lang w:val="en-US"/>
-              </w:rPr>
-              <w:t>và số l</w:t>
-            </w:r>
-            <w:r>
-              <w:rPr>
-                <w:rFonts w:ascii="Times New Roman" w:hAnsi="Times New Roman" w:hint="eastAsia"/>
-                <w:spacing w:val="-2"/>
-                <w:sz w:val="20"/>
-                <w:lang w:val="en-US"/>
-              </w:rPr>
-              <w:t>ư</w:t>
-            </w:r>
-            <w:r>
-              <w:rPr>
-                <w:rFonts w:ascii="Times New Roman" w:hAnsi="Times New Roman"/>
-                <w:spacing w:val="-2"/>
-                <w:sz w:val="20"/>
-                <w:lang w:val="en-US"/>
-              </w:rPr>
-              <w:t>ợng bản l</w:t>
-            </w:r>
-            <w:r>
-              <w:rPr>
-                <w:rFonts w:ascii="Times New Roman" w:hAnsi="Times New Roman" w:hint="eastAsia"/>
-                <w:spacing w:val="-2"/>
-                <w:sz w:val="20"/>
-                <w:lang w:val="en-US"/>
-              </w:rPr>
-              <w:t>ư</w:t>
-            </w:r>
-            <w:r>
-              <w:rPr>
-                <w:rFonts w:ascii="Times New Roman" w:hAnsi="Times New Roman"/>
-                <w:spacing w:val="-2"/>
-                <w:sz w:val="20"/>
-                <w:lang w:val="en-US"/>
-              </w:rPr>
-              <w:t>u.</w:t>
-            </w:r>
-          </w:p>
-          <w:p>
-            <w:pPr>
-              <w:jc w:val="both"/>
-              <w:rPr>
-                <w:rFonts w:ascii="Times New Roman" w:hAnsi="Times New Roman"/>
-                <w:sz w:val="20"/>
-                <w:lang w:val="en-US"/>
-              </w:rPr>
-            </w:pPr>
-            <w:r>
-              <w:rPr>
-                <w:rFonts w:ascii="Times New Roman" w:hAnsi="Times New Roman"/>
-                <w:sz w:val="20"/>
-                <w:lang w:val="en-US"/>
-              </w:rPr>
-              <w:t>(</w:t>
-            </w:r>
-            <w:r>
-              <w:rPr>
-                <w:rFonts w:ascii="Times New Roman" w:hAnsi="Times New Roman"/>
-                <w:sz w:val="20"/>
-                <w:lang w:val="en-US"/>
-              </w:rPr>
-              <w:t>7</w:t>
-            </w:r>
-            <w:r>
-              <w:rPr>
-                <w:rFonts w:ascii="Times New Roman" w:hAnsi="Times New Roman"/>
-                <w:sz w:val="20"/>
-                <w:lang w:val="en-US"/>
-              </w:rPr>
-              <w:t xml:space="preserve">) Ký hiệu </w:t>
-            </w:r>
-            <w:r>
-              <w:rPr>
-                <w:rFonts w:ascii="Times New Roman" w:hAnsi="Times New Roman"/>
-                <w:sz w:val="20"/>
-                <w:lang w:val="en-US"/>
-              </w:rPr>
-              <w:t xml:space="preserve">của </w:t>
-            </w:r>
-            <w:r>
-              <w:rPr>
-                <w:rFonts w:ascii="Times New Roman" w:hAnsi="Times New Roman"/>
-                <w:sz w:val="20"/>
-                <w:lang w:val="en-US"/>
-              </w:rPr>
-              <w:t>ng</w:t>
-            </w:r>
-            <w:r>
-              <w:rPr>
-                <w:rFonts w:ascii="Times New Roman" w:hAnsi="Times New Roman" w:hint="eastAsia"/>
-                <w:sz w:val="20"/>
-                <w:lang w:val="en-US"/>
-              </w:rPr>
-              <w:t>ư</w:t>
-            </w:r>
-            <w:r>
-              <w:rPr>
-                <w:rFonts w:ascii="Times New Roman" w:hAnsi="Times New Roman"/>
-                <w:sz w:val="20"/>
-                <w:lang w:val="en-US"/>
-              </w:rPr>
-              <w:t xml:space="preserve">ời </w:t>
-            </w:r>
-            <w:r>
-              <w:rPr>
-                <w:rFonts w:ascii="Times New Roman" w:hAnsi="Times New Roman"/>
-                <w:sz w:val="20"/>
-                <w:lang w:val="en-US"/>
-              </w:rPr>
-              <w:t>soạn thảo</w:t>
-            </w:r>
-            <w:r>
-              <w:rPr>
-                <w:rFonts w:ascii="Times New Roman" w:hAnsi="Times New Roman"/>
-                <w:sz w:val="20"/>
-                <w:lang w:val="en-US"/>
-              </w:rPr>
-              <w:t xml:space="preserve"> và số l</w:t>
-            </w:r>
-            <w:r>
-              <w:rPr>
-                <w:rFonts w:ascii="Times New Roman" w:hAnsi="Times New Roman" w:hint="eastAsia"/>
-                <w:sz w:val="20"/>
-                <w:lang w:val="en-US"/>
-              </w:rPr>
-              <w:t>ư</w:t>
-            </w:r>
-            <w:r>
-              <w:rPr>
-                <w:rFonts w:ascii="Times New Roman" w:hAnsi="Times New Roman"/>
-                <w:sz w:val="20"/>
-                <w:lang w:val="en-US"/>
-              </w:rPr>
-              <w:t>ợng bản phát hành.</w:t>
-            </w:r>
+            <w:proofErr w:type="spellStart"/>
+            <w:r>
+              <w:rPr>
+                <w:rFonts w:ascii="Times New Roman" w:hAnsi="Times New Roman"/>
+                <w:b/>
+                <w:szCs w:val="28"/>
+              </w:rPr>
+              <w:t>Và</w:t>
+            </w:r>
+            <w:proofErr w:type="spellEnd"/>
+            <w:r>
+              <w:rPr>
+                <w:rFonts w:ascii="Times New Roman" w:hAnsi="Times New Roman"/>
+                <w:b/>
+                <w:szCs w:val="28"/>
+              </w:rPr>
+              <w:t xml:space="preserve"> </w:t>
+            </w:r>
+            <w:proofErr w:type="spellStart"/>
+            <w:r>
+              <w:rPr>
+                <w:rFonts w:ascii="Times New Roman" w:hAnsi="Times New Roman"/>
+                <w:b/>
+                <w:szCs w:val="28"/>
+              </w:rPr>
+              <w:t>Tên</w:t>
+            </w:r>
+            <w:proofErr w:type="spellEnd"/>
           </w:p>
         </w:tc>
       </w:tr>
@@ -1961,21 +1560,6 @@
         <w:pStyle w:val="FootnoteText"/>
         <w:jc w:val="both"/>
       </w:pPr>
-      <w:r>
-        <w:t>(</w:t>
-      </w:r>
-      <w:r>
-        <w:t>8</w:t>
-      </w:r>
-      <w:r>
-        <w:t xml:space="preserve">) Ghi số </w:t>
-      </w:r>
-      <w:r>
-        <w:t>eOffice</w:t>
-      </w:r>
-      <w:r>
-        <w:t>.</w:t>
-      </w:r>
     </w:p>
     <w:sectPr>
       <w:headerReference w:type="default" r:id="rId7"/>
@@ -1992,7 +1576,7 @@
 </file>
 
 <file path=word/endnotes.xml><?xml version="1.0" encoding="utf-8"?>
-<w:endnotes xmlns:wpc="http://schemas.microsoft.com/office/word/2010/wordprocessingCanvas" xmlns:cx="http://schemas.microsoft.com/office/drawing/2014/chartex" xmlns:cx1="http://schemas.microsoft.com/office/drawing/2015/9/8/chartex" xmlns:cx2="http://schemas.microsoft.com/office/drawing/2015/10/21/chartex" xmlns:cx3="http://schemas.microsoft.com/office/drawing/2016/5/9/chartex" xmlns:cx4="http://schemas.microsoft.com/office/drawing/2016/5/10/chartex" xmlns:cx5="http://schemas.microsoft.com/office/drawing/2016/5/11/chartex" xmlns:cx6="http://schemas.microsoft.com/office/drawing/2016/5/12/chartex" xmlns:cx7="http://schemas.microsoft.com/office/drawing/2016/5/13/chartex" xmlns:cx8="http://schemas.microsoft.com/office/drawing/2016/5/14/chartex" xmlns:mc="http://schemas.openxmlformats.org/markup-compatibility/2006" xmlns:aink="http://schemas.microsoft.com/office/drawing/2016/ink" xmlns:am3d="http://schemas.microsoft.com/office/drawing/2017/model3d" xmlns:o="urn:schemas-microsoft-com:office:office" xmlns:oel="http://schemas.microsoft.com/office/2019/extlst" xmlns:r="http://schemas.openxmlformats.org/officeDocument/2006/relationships" xmlns:m="http://schemas.openxmlformats.org/officeDocument/2006/math" xmlns:v="urn:schemas-microsoft-com:vml" xmlns:wp14="http://schemas.microsoft.com/office/word/2010/wordprocessingDrawing" xmlns:wp="http://schemas.openxmlformats.org/drawingml/2006/wordprocessingDrawing" xmlns:w10="urn:schemas-microsoft-com:office:word" xmlns:w="http://schemas.openxmlformats.org/wordprocessingml/2006/main" xmlns:w14="http://schemas.microsoft.com/office/word/2010/wordml" xmlns:w15="http://schemas.microsoft.com/office/word/2012/wordml" xmlns:w16cex="http://schemas.microsoft.com/office/word/2018/wordml/cex" xmlns:w16cid="http://schemas.microsoft.com/office/word/2016/wordml/cid" xmlns:w16="http://schemas.microsoft.com/office/word/2018/wordml" xmlns:w16du="http://schemas.microsoft.com/office/word/2023/wordml/word16du" xmlns:w16sdtdh="http://schemas.microsoft.com/office/word/2020/wordml/sdtdatahash" xmlns:w16sdtfl="http://schemas.microsoft.com/office/word/2024/wordml/sdtformatlock" xmlns:w16se="http://schemas.microsoft.com/office/word/2015/wordml/symex" xmlns:wpg="http://schemas.microsoft.com/office/word/2010/wordprocessingGroup" xmlns:wpi="http://schemas.microsoft.com/office/word/2010/wordprocessingInk" xmlns:wne="http://schemas.microsoft.com/office/word/2006/wordml" xmlns:wps="http://schemas.microsoft.com/office/word/2010/wordprocessingShape" mc:Ignorable="w14 w15 w16se w16cid w16 w16cex w16sdtdh w16sdtfl w16du wp14">
+<w:endnotes xmlns:wpc="http://schemas.microsoft.com/office/word/2010/wordprocessingCanvas" xmlns:cx="http://schemas.microsoft.com/office/drawing/2014/chartex" xmlns:cx1="http://schemas.microsoft.com/office/drawing/2015/9/8/chartex" xmlns:cx2="http://schemas.microsoft.com/office/drawing/2015/10/21/chartex" xmlns:cx3="http://schemas.microsoft.com/office/drawing/2016/5/9/chartex" xmlns:cx4="http://schemas.microsoft.com/office/drawing/2016/5/10/chartex" xmlns:cx5="http://schemas.microsoft.com/office/drawing/2016/5/11/chartex" xmlns:cx6="http://schemas.microsoft.com/office/drawing/2016/5/12/chartex" xmlns:cx7="http://schemas.microsoft.com/office/drawing/2016/5/13/chartex" xmlns:cx8="http://schemas.microsoft.com/office/drawing/2016/5/14/chartex" xmlns:mc="http://schemas.openxmlformats.org/markup-compatibility/2006" xmlns:aink="http://schemas.microsoft.com/office/drawing/2016/ink" xmlns:am3d="http://schemas.microsoft.com/office/drawing/2017/model3d" xmlns:o="urn:schemas-microsoft-com:office:office" xmlns:oel="http://schemas.microsoft.com/office/2019/extlst" xmlns:r="http://schemas.openxmlformats.org/officeDocument/2006/relationships" xmlns:m="http://schemas.openxmlformats.org/officeDocument/2006/math" xmlns:v="urn:schemas-microsoft-com:vml" xmlns:wp14="http://schemas.microsoft.com/office/word/2010/wordprocessingDrawing" xmlns:wp="http://schemas.openxmlformats.org/drawingml/2006/wordprocessingDrawing" xmlns:w10="urn:schemas-microsoft-com:office:word" xmlns:w="http://schemas.openxmlformats.org/wordprocessingml/2006/main" xmlns:w14="http://schemas.microsoft.com/office/word/2010/wordml" xmlns:w15="http://schemas.microsoft.com/office/word/2012/wordml" xmlns:w16cei="http://schemas.microsoft.com/office/word/2026/wordml/cei" xmlns:w16cex="http://schemas.microsoft.com/office/word/2018/wordml/cex" xmlns:w16cid="http://schemas.microsoft.com/office/word/2016/wordml/cid" xmlns:w16="http://schemas.microsoft.com/office/word/2018/wordml" xmlns:w16du="http://schemas.microsoft.com/office/word/2023/wordml/word16du" xmlns:w16sdtdh="http://schemas.microsoft.com/office/word/2020/wordml/sdtdatahash" xmlns:w16sdtfl="http://schemas.microsoft.com/office/word/2024/wordml/sdtformatlock" xmlns:w16se="http://schemas.microsoft.com/office/word/2015/wordml/symex" xmlns:wpg="http://schemas.microsoft.com/office/word/2010/wordprocessingGroup" xmlns:wpi="http://schemas.microsoft.com/office/word/2010/wordprocessingInk" xmlns:wne="http://schemas.microsoft.com/office/word/2006/wordml" xmlns:wps="http://schemas.microsoft.com/office/word/2010/wordprocessingShape" mc:Ignorable="w14 w15 w16se w16cid w16 w16cex w16sdtdh w16sdtfl w16du wp14">
   <w:endnote w:type="separator" w:id="-1">
     <w:p>
       <w:r>
@@ -2011,7 +1595,7 @@
 </file>
 
 <file path=word/footer1.xml><?xml version="1.0" encoding="utf-8"?>
-<w:ftr xmlns:wpc="http://schemas.microsoft.com/office/word/2010/wordprocessingCanvas" xmlns:cx="http://schemas.microsoft.com/office/drawing/2014/chartex" xmlns:cx1="http://schemas.microsoft.com/office/drawing/2015/9/8/chartex" xmlns:cx2="http://schemas.microsoft.com/office/drawing/2015/10/21/chartex" xmlns:cx3="http://schemas.microsoft.com/office/drawing/2016/5/9/chartex" xmlns:cx4="http://schemas.microsoft.com/office/drawing/2016/5/10/chartex" xmlns:cx5="http://schemas.microsoft.com/office/drawing/2016/5/11/chartex" xmlns:cx6="http://schemas.microsoft.com/office/drawing/2016/5/12/chartex" xmlns:cx7="http://schemas.microsoft.com/office/drawing/2016/5/13/chartex" xmlns:cx8="http://schemas.microsoft.com/office/drawing/2016/5/14/chartex" xmlns:mc="http://schemas.openxmlformats.org/markup-compatibility/2006" xmlns:aink="http://schemas.microsoft.com/office/drawing/2016/ink" xmlns:am3d="http://schemas.microsoft.com/office/drawing/2017/model3d" xmlns:o="urn:schemas-microsoft-com:office:office" xmlns:oel="http://schemas.microsoft.com/office/2019/extlst" xmlns:r="http://schemas.openxmlformats.org/officeDocument/2006/relationships" xmlns:m="http://schemas.openxmlformats.org/officeDocument/2006/math" xmlns:v="urn:schemas-microsoft-com:vml" xmlns:wp14="http://schemas.microsoft.com/office/word/2010/wordprocessingDrawing" xmlns:wp="http://schemas.openxmlformats.org/drawingml/2006/wordprocessingDrawing" xmlns:w10="urn:schemas-microsoft-com:office:word" xmlns:w="http://schemas.openxmlformats.org/wordprocessingml/2006/main" xmlns:w14="http://schemas.microsoft.com/office/word/2010/wordml" xmlns:w15="http://schemas.microsoft.com/office/word/2012/wordml" xmlns:w16cex="http://schemas.microsoft.com/office/word/2018/wordml/cex" xmlns:w16cid="http://schemas.microsoft.com/office/word/2016/wordml/cid" xmlns:w16="http://schemas.microsoft.com/office/word/2018/wordml" xmlns:w16du="http://schemas.microsoft.com/office/word/2023/wordml/word16du" xmlns:w16sdtdh="http://schemas.microsoft.com/office/word/2020/wordml/sdtdatahash" xmlns:w16sdtfl="http://schemas.microsoft.com/office/word/2024/wordml/sdtformatlock" xmlns:w16se="http://schemas.microsoft.com/office/word/2015/wordml/symex" xmlns:wpg="http://schemas.microsoft.com/office/word/2010/wordprocessingGroup" xmlns:wpi="http://schemas.microsoft.com/office/word/2010/wordprocessingInk" xmlns:wne="http://schemas.microsoft.com/office/word/2006/wordml" xmlns:wps="http://schemas.microsoft.com/office/word/2010/wordprocessingShape" mc:Ignorable="w14 w15 w16se w16cid w16 w16cex w16sdtdh w16sdtfl w16du wp14">
+<w:ftr xmlns:wpc="http://schemas.microsoft.com/office/word/2010/wordprocessingCanvas" xmlns:cx="http://schemas.microsoft.com/office/drawing/2014/chartex" xmlns:cx1="http://schemas.microsoft.com/office/drawing/2015/9/8/chartex" xmlns:cx2="http://schemas.microsoft.com/office/drawing/2015/10/21/chartex" xmlns:cx3="http://schemas.microsoft.com/office/drawing/2016/5/9/chartex" xmlns:cx4="http://schemas.microsoft.com/office/drawing/2016/5/10/chartex" xmlns:cx5="http://schemas.microsoft.com/office/drawing/2016/5/11/chartex" xmlns:cx6="http://schemas.microsoft.com/office/drawing/2016/5/12/chartex" xmlns:cx7="http://schemas.microsoft.com/office/drawing/2016/5/13/chartex" xmlns:cx8="http://schemas.microsoft.com/office/drawing/2016/5/14/chartex" xmlns:mc="http://schemas.openxmlformats.org/markup-compatibility/2006" xmlns:aink="http://schemas.microsoft.com/office/drawing/2016/ink" xmlns:am3d="http://schemas.microsoft.com/office/drawing/2017/model3d" xmlns:o="urn:schemas-microsoft-com:office:office" xmlns:oel="http://schemas.microsoft.com/office/2019/extlst" xmlns:r="http://schemas.openxmlformats.org/officeDocument/2006/relationships" xmlns:m="http://schemas.openxmlformats.org/officeDocument/2006/math" xmlns:v="urn:schemas-microsoft-com:vml" xmlns:wp14="http://schemas.microsoft.com/office/word/2010/wordprocessingDrawing" xmlns:wp="http://schemas.openxmlformats.org/drawingml/2006/wordprocessingDrawing" xmlns:w10="urn:schemas-microsoft-com:office:word" xmlns:w="http://schemas.openxmlformats.org/wordprocessingml/2006/main" xmlns:w14="http://schemas.microsoft.com/office/word/2010/wordml" xmlns:w15="http://schemas.microsoft.com/office/word/2012/wordml" xmlns:w16cei="http://schemas.microsoft.com/office/word/2026/wordml/cei" xmlns:w16cex="http://schemas.microsoft.com/office/word/2018/wordml/cex" xmlns:w16cid="http://schemas.microsoft.com/office/word/2016/wordml/cid" xmlns:w16="http://schemas.microsoft.com/office/word/2018/wordml" xmlns:w16du="http://schemas.microsoft.com/office/word/2023/wordml/word16du" xmlns:w16sdtdh="http://schemas.microsoft.com/office/word/2020/wordml/sdtdatahash" xmlns:w16sdtfl="http://schemas.microsoft.com/office/word/2024/wordml/sdtformatlock" xmlns:w16se="http://schemas.microsoft.com/office/word/2015/wordml/symex" xmlns:wpg="http://schemas.microsoft.com/office/word/2010/wordprocessingGroup" xmlns:wpi="http://schemas.microsoft.com/office/word/2010/wordprocessingInk" xmlns:wne="http://schemas.microsoft.com/office/word/2006/wordml" xmlns:wps="http://schemas.microsoft.com/office/word/2010/wordprocessingShape" mc:Ignorable="w14 w15 w16se w16cid w16 w16cex w16sdtdh w16sdtfl w16du wp14">
   <w:p>
     <w:pPr>
       <w:pStyle w:val="Footer"/>
@@ -2056,7 +1640,7 @@
 </file>
 
 <file path=word/footer2.xml><?xml version="1.0" encoding="utf-8"?>
-<w:ftr xmlns:wpc="http://schemas.microsoft.com/office/word/2010/wordprocessingCanvas" xmlns:cx="http://schemas.microsoft.com/office/drawing/2014/chartex" xmlns:cx1="http://schemas.microsoft.com/office/drawing/2015/9/8/chartex" xmlns:cx2="http://schemas.microsoft.com/office/drawing/2015/10/21/chartex" xmlns:cx3="http://schemas.microsoft.com/office/drawing/2016/5/9/chartex" xmlns:cx4="http://schemas.microsoft.com/office/drawing/2016/5/10/chartex" xmlns:cx5="http://schemas.microsoft.com/office/drawing/2016/5/11/chartex" xmlns:cx6="http://schemas.microsoft.com/office/drawing/2016/5/12/chartex" xmlns:cx7="http://schemas.microsoft.com/office/drawing/2016/5/13/chartex" xmlns:cx8="http://schemas.microsoft.com/office/drawing/2016/5/14/chartex" xmlns:mc="http://schemas.openxmlformats.org/markup-compatibility/2006" xmlns:aink="http://schemas.microsoft.com/office/drawing/2016/ink" xmlns:am3d="http://schemas.microsoft.com/office/drawing/2017/model3d" xmlns:o="urn:schemas-microsoft-com:office:office" xmlns:oel="http://schemas.microsoft.com/office/2019/extlst" xmlns:r="http://schemas.openxmlformats.org/officeDocument/2006/relationships" xmlns:m="http://schemas.openxmlformats.org/officeDocument/2006/math" xmlns:v="urn:schemas-microsoft-com:vml" xmlns:wp14="http://schemas.microsoft.com/office/word/2010/wordprocessingDrawing" xmlns:wp="http://schemas.openxmlformats.org/drawingml/2006/wordprocessingDrawing" xmlns:w10="urn:schemas-microsoft-com:office:word" xmlns:w="http://schemas.openxmlformats.org/wordprocessingml/2006/main" xmlns:w14="http://schemas.microsoft.com/office/word/2010/wordml" xmlns:w15="http://schemas.microsoft.com/office/word/2012/wordml" xmlns:w16cex="http://schemas.microsoft.com/office/word/2018/wordml/cex" xmlns:w16cid="http://schemas.microsoft.com/office/word/2016/wordml/cid" xmlns:w16="http://schemas.microsoft.com/office/word/2018/wordml" xmlns:w16du="http://schemas.microsoft.com/office/word/2023/wordml/word16du" xmlns:w16sdtdh="http://schemas.microsoft.com/office/word/2020/wordml/sdtdatahash" xmlns:w16sdtfl="http://schemas.microsoft.com/office/word/2024/wordml/sdtformatlock" xmlns:w16se="http://schemas.microsoft.com/office/word/2015/wordml/symex" xmlns:wpg="http://schemas.microsoft.com/office/word/2010/wordprocessingGroup" xmlns:wpi="http://schemas.microsoft.com/office/word/2010/wordprocessingInk" xmlns:wne="http://schemas.microsoft.com/office/word/2006/wordml" xmlns:wps="http://schemas.microsoft.com/office/word/2010/wordprocessingShape" mc:Ignorable="w14 w15 w16se w16cid w16 w16cex w16sdtdh w16sdtfl w16du wp14">
+<w:ftr xmlns:wpc="http://schemas.microsoft.com/office/word/2010/wordprocessingCanvas" xmlns:cx="http://schemas.microsoft.com/office/drawing/2014/chartex" xmlns:cx1="http://schemas.microsoft.com/office/drawing/2015/9/8/chartex" xmlns:cx2="http://schemas.microsoft.com/office/drawing/2015/10/21/chartex" xmlns:cx3="http://schemas.microsoft.com/office/drawing/2016/5/9/chartex" xmlns:cx4="http://schemas.microsoft.com/office/drawing/2016/5/10/chartex" xmlns:cx5="http://schemas.microsoft.com/office/drawing/2016/5/11/chartex" xmlns:cx6="http://schemas.microsoft.com/office/drawing/2016/5/12/chartex" xmlns:cx7="http://schemas.microsoft.com/office/drawing/2016/5/13/chartex" xmlns:cx8="http://schemas.microsoft.com/office/drawing/2016/5/14/chartex" xmlns:mc="http://schemas.openxmlformats.org/markup-compatibility/2006" xmlns:aink="http://schemas.microsoft.com/office/drawing/2016/ink" xmlns:am3d="http://schemas.microsoft.com/office/drawing/2017/model3d" xmlns:o="urn:schemas-microsoft-com:office:office" xmlns:oel="http://schemas.microsoft.com/office/2019/extlst" xmlns:r="http://schemas.openxmlformats.org/officeDocument/2006/relationships" xmlns:m="http://schemas.openxmlformats.org/officeDocument/2006/math" xmlns:v="urn:schemas-microsoft-com:vml" xmlns:wp14="http://schemas.microsoft.com/office/word/2010/wordprocessingDrawing" xmlns:wp="http://schemas.openxmlformats.org/drawingml/2006/wordprocessingDrawing" xmlns:w10="urn:schemas-microsoft-com:office:word" xmlns:w="http://schemas.openxmlformats.org/wordprocessingml/2006/main" xmlns:w14="http://schemas.microsoft.com/office/word/2010/wordml" xmlns:w15="http://schemas.microsoft.com/office/word/2012/wordml" xmlns:w16cei="http://schemas.microsoft.com/office/word/2026/wordml/cei" xmlns:w16cex="http://schemas.microsoft.com/office/word/2018/wordml/cex" xmlns:w16cid="http://schemas.microsoft.com/office/word/2016/wordml/cid" xmlns:w16="http://schemas.microsoft.com/office/word/2018/wordml" xmlns:w16du="http://schemas.microsoft.com/office/word/2023/wordml/word16du" xmlns:w16sdtdh="http://schemas.microsoft.com/office/word/2020/wordml/sdtdatahash" xmlns:w16sdtfl="http://schemas.microsoft.com/office/word/2024/wordml/sdtformatlock" xmlns:w16se="http://schemas.microsoft.com/office/word/2015/wordml/symex" xmlns:wpg="http://schemas.microsoft.com/office/word/2010/wordprocessingGroup" xmlns:wpi="http://schemas.microsoft.com/office/word/2010/wordprocessingInk" xmlns:wne="http://schemas.microsoft.com/office/word/2006/wordml" xmlns:wps="http://schemas.microsoft.com/office/word/2010/wordprocessingShape" mc:Ignorable="w14 w15 w16se w16cid w16 w16cex w16sdtdh w16sdtfl w16du wp14">
   <w:p>
     <w:pPr>
       <w:pStyle w:val="Footer"/>
@@ -2067,7 +1651,7 @@
 </file>
 
 <file path=word/footnotes.xml><?xml version="1.0" encoding="utf-8"?>
-<w:footnotes xmlns:wpc="http://schemas.microsoft.com/office/word/2010/wordprocessingCanvas" xmlns:cx="http://schemas.microsoft.com/office/drawing/2014/chartex" xmlns:cx1="http://schemas.microsoft.com/office/drawing/2015/9/8/chartex" xmlns:cx2="http://schemas.microsoft.com/office/drawing/2015/10/21/chartex" xmlns:cx3="http://schemas.microsoft.com/office/drawing/2016/5/9/chartex" xmlns:cx4="http://schemas.microsoft.com/office/drawing/2016/5/10/chartex" xmlns:cx5="http://schemas.microsoft.com/office/drawing/2016/5/11/chartex" xmlns:cx6="http://schemas.microsoft.com/office/drawing/2016/5/12/chartex" xmlns:cx7="http://schemas.microsoft.com/office/drawing/2016/5/13/chartex" xmlns:cx8="http://schemas.microsoft.com/office/drawing/2016/5/14/chartex" xmlns:mc="http://schemas.openxmlformats.org/markup-compatibility/2006" xmlns:aink="http://schemas.microsoft.com/office/drawing/2016/ink" xmlns:am3d="http://schemas.microsoft.com/office/drawing/2017/model3d" xmlns:o="urn:schemas-microsoft-com:office:office" xmlns:oel="http://schemas.microsoft.com/office/2019/extlst" xmlns:r="http://schemas.openxmlformats.org/officeDocument/2006/relationships" xmlns:m="http://schemas.openxmlformats.org/officeDocument/2006/math" xmlns:v="urn:schemas-microsoft-com:vml" xmlns:wp14="http://schemas.microsoft.com/office/word/2010/wordprocessingDrawing" xmlns:wp="http://schemas.openxmlformats.org/drawingml/2006/wordprocessingDrawing" xmlns:w10="urn:schemas-microsoft-com:office:word" xmlns:w="http://schemas.openxmlformats.org/wordprocessingml/2006/main" xmlns:w14="http://schemas.microsoft.com/office/word/2010/wordml" xmlns:w15="http://schemas.microsoft.com/office/word/2012/wordml" xmlns:w16cex="http://schemas.microsoft.com/office/word/2018/wordml/cex" xmlns:w16cid="http://schemas.microsoft.com/office/word/2016/wordml/cid" xmlns:w16="http://schemas.microsoft.com/office/word/2018/wordml" xmlns:w16du="http://schemas.microsoft.com/office/word/2023/wordml/word16du" xmlns:w16sdtdh="http://schemas.microsoft.com/office/word/2020/wordml/sdtdatahash" xmlns:w16sdtfl="http://schemas.microsoft.com/office/word/2024/wordml/sdtformatlock" xmlns:w16se="http://schemas.microsoft.com/office/word/2015/wordml/symex" xmlns:wpg="http://schemas.microsoft.com/office/word/2010/wordprocessingGroup" xmlns:wpi="http://schemas.microsoft.com/office/word/2010/wordprocessingInk" xmlns:wne="http://schemas.microsoft.com/office/word/2006/wordml" xmlns:wps="http://schemas.microsoft.com/office/word/2010/wordprocessingShape" mc:Ignorable="w14 w15 w16se w16cid w16 w16cex w16sdtdh w16sdtfl w16du wp14">
+<w:footnotes xmlns:wpc="http://schemas.microsoft.com/office/word/2010/wordprocessingCanvas" xmlns:cx="http://schemas.microsoft.com/office/drawing/2014/chartex" xmlns:cx1="http://schemas.microsoft.com/office/drawing/2015/9/8/chartex" xmlns:cx2="http://schemas.microsoft.com/office/drawing/2015/10/21/chartex" xmlns:cx3="http://schemas.microsoft.com/office/drawing/2016/5/9/chartex" xmlns:cx4="http://schemas.microsoft.com/office/drawing/2016/5/10/chartex" xmlns:cx5="http://schemas.microsoft.com/office/drawing/2016/5/11/chartex" xmlns:cx6="http://schemas.microsoft.com/office/drawing/2016/5/12/chartex" xmlns:cx7="http://schemas.microsoft.com/office/drawing/2016/5/13/chartex" xmlns:cx8="http://schemas.microsoft.com/office/drawing/2016/5/14/chartex" xmlns:mc="http://schemas.openxmlformats.org/markup-compatibility/2006" xmlns:aink="http://schemas.microsoft.com/office/drawing/2016/ink" xmlns:am3d="http://schemas.microsoft.com/office/drawing/2017/model3d" xmlns:o="urn:schemas-microsoft-com:office:office" xmlns:oel="http://schemas.microsoft.com/office/2019/extlst" xmlns:r="http://schemas.openxmlformats.org/officeDocument/2006/relationships" xmlns:m="http://schemas.openxmlformats.org/officeDocument/2006/math" xmlns:v="urn:schemas-microsoft-com:vml" xmlns:wp14="http://schemas.microsoft.com/office/word/2010/wordprocessingDrawing" xmlns:wp="http://schemas.openxmlformats.org/drawingml/2006/wordprocessingDrawing" xmlns:w10="urn:schemas-microsoft-com:office:word" xmlns:w="http://schemas.openxmlformats.org/wordprocessingml/2006/main" xmlns:w14="http://schemas.microsoft.com/office/word/2010/wordml" xmlns:w15="http://schemas.microsoft.com/office/word/2012/wordml" xmlns:w16cei="http://schemas.microsoft.com/office/word/2026/wordml/cei" xmlns:w16cex="http://schemas.microsoft.com/office/word/2018/wordml/cex" xmlns:w16cid="http://schemas.microsoft.com/office/word/2016/wordml/cid" xmlns:w16="http://schemas.microsoft.com/office/word/2018/wordml" xmlns:w16du="http://schemas.microsoft.com/office/word/2023/wordml/word16du" xmlns:w16sdtdh="http://schemas.microsoft.com/office/word/2020/wordml/sdtdatahash" xmlns:w16sdtfl="http://schemas.microsoft.com/office/word/2024/wordml/sdtformatlock" xmlns:w16se="http://schemas.microsoft.com/office/word/2015/wordml/symex" xmlns:wpg="http://schemas.microsoft.com/office/word/2010/wordprocessingGroup" xmlns:wpi="http://schemas.microsoft.com/office/word/2010/wordprocessingInk" xmlns:wne="http://schemas.microsoft.com/office/word/2006/wordml" xmlns:wps="http://schemas.microsoft.com/office/word/2010/wordprocessingShape" mc:Ignorable="w14 w15 w16se w16cid w16 w16cex w16sdtdh w16sdtfl w16du wp14">
   <w:footnote w:type="separator" w:id="-1">
     <w:p>
       <w:r>
@@ -2086,7 +1670,7 @@
 </file>
 
 <file path=word/header1.xml><?xml version="1.0" encoding="utf-8"?>
-<w:hdr xmlns:wpc="http://schemas.microsoft.com/office/word/2010/wordprocessingCanvas" xmlns:cx="http://schemas.microsoft.com/office/drawing/2014/chartex" xmlns:cx1="http://schemas.microsoft.com/office/drawing/2015/9/8/chartex" xmlns:cx2="http://schemas.microsoft.com/office/drawing/2015/10/21/chartex" xmlns:cx3="http://schemas.microsoft.com/office/drawing/2016/5/9/chartex" xmlns:cx4="http://schemas.microsoft.com/office/drawing/2016/5/10/chartex" xmlns:cx5="http://schemas.microsoft.com/office/drawing/2016/5/11/chartex" xmlns:cx6="http://schemas.microsoft.com/office/drawing/2016/5/12/chartex" xmlns:cx7="http://schemas.microsoft.com/office/drawing/2016/5/13/chartex" xmlns:cx8="http://schemas.microsoft.com/office/drawing/2016/5/14/chartex" xmlns:mc="http://schemas.openxmlformats.org/markup-compatibility/2006" xmlns:aink="http://schemas.microsoft.com/office/drawing/2016/ink" xmlns:am3d="http://schemas.microsoft.com/office/drawing/2017/model3d" xmlns:o="urn:schemas-microsoft-com:office:office" xmlns:oel="http://schemas.microsoft.com/office/2019/extlst" xmlns:r="http://schemas.openxmlformats.org/officeDocument/2006/relationships" xmlns:m="http://schemas.openxmlformats.org/officeDocument/2006/math" xmlns:v="urn:schemas-microsoft-com:vml" xmlns:wp14="http://schemas.microsoft.com/office/word/2010/wordprocessingDrawing" xmlns:wp="http://schemas.openxmlformats.org/drawingml/2006/wordprocessingDrawing" xmlns:w10="urn:schemas-microsoft-com:office:word" xmlns:w="http://schemas.openxmlformats.org/wordprocessingml/2006/main" xmlns:w14="http://schemas.microsoft.com/office/word/2010/wordml" xmlns:w15="http://schemas.microsoft.com/office/word/2012/wordml" xmlns:w16cex="http://schemas.microsoft.com/office/word/2018/wordml/cex" xmlns:w16cid="http://schemas.microsoft.com/office/word/2016/wordml/cid" xmlns:w16="http://schemas.microsoft.com/office/word/2018/wordml" xmlns:w16du="http://schemas.microsoft.com/office/word/2023/wordml/word16du" xmlns:w16sdtdh="http://schemas.microsoft.com/office/word/2020/wordml/sdtdatahash" xmlns:w16sdtfl="http://schemas.microsoft.com/office/word/2024/wordml/sdtformatlock" xmlns:w16se="http://schemas.microsoft.com/office/word/2015/wordml/symex" xmlns:wpg="http://schemas.microsoft.com/office/word/2010/wordprocessingGroup" xmlns:wpi="http://schemas.microsoft.com/office/word/2010/wordprocessingInk" xmlns:wne="http://schemas.microsoft.com/office/word/2006/wordml" xmlns:wps="http://schemas.microsoft.com/office/word/2010/wordprocessingShape" mc:Ignorable="w14 w15 w16se w16cid w16 w16cex w16sdtdh w16sdtfl w16du wp14">
+<w:hdr xmlns:wpc="http://schemas.microsoft.com/office/word/2010/wordprocessingCanvas" xmlns:cx="http://schemas.microsoft.com/office/drawing/2014/chartex" xmlns:cx1="http://schemas.microsoft.com/office/drawing/2015/9/8/chartex" xmlns:cx2="http://schemas.microsoft.com/office/drawing/2015/10/21/chartex" xmlns:cx3="http://schemas.microsoft.com/office/drawing/2016/5/9/chartex" xmlns:cx4="http://schemas.microsoft.com/office/drawing/2016/5/10/chartex" xmlns:cx5="http://schemas.microsoft.com/office/drawing/2016/5/11/chartex" xmlns:cx6="http://schemas.microsoft.com/office/drawing/2016/5/12/chartex" xmlns:cx7="http://schemas.microsoft.com/office/drawing/2016/5/13/chartex" xmlns:cx8="http://schemas.microsoft.com/office/drawing/2016/5/14/chartex" xmlns:mc="http://schemas.openxmlformats.org/markup-compatibility/2006" xmlns:aink="http://schemas.microsoft.com/office/drawing/2016/ink" xmlns:am3d="http://schemas.microsoft.com/office/drawing/2017/model3d" xmlns:o="urn:schemas-microsoft-com:office:office" xmlns:oel="http://schemas.microsoft.com/office/2019/extlst" xmlns:r="http://schemas.openxmlformats.org/officeDocument/2006/relationships" xmlns:m="http://schemas.openxmlformats.org/officeDocument/2006/math" xmlns:v="urn:schemas-microsoft-com:vml" xmlns:wp14="http://schemas.microsoft.com/office/word/2010/wordprocessingDrawing" xmlns:wp="http://schemas.openxmlformats.org/drawingml/2006/wordprocessingDrawing" xmlns:w10="urn:schemas-microsoft-com:office:word" xmlns:w="http://schemas.openxmlformats.org/wordprocessingml/2006/main" xmlns:w14="http://schemas.microsoft.com/office/word/2010/wordml" xmlns:w15="http://schemas.microsoft.com/office/word/2012/wordml" xmlns:w16cei="http://schemas.microsoft.com/office/word/2026/wordml/cei" xmlns:w16cex="http://schemas.microsoft.com/office/word/2018/wordml/cex" xmlns:w16cid="http://schemas.microsoft.com/office/word/2016/wordml/cid" xmlns:w16="http://schemas.microsoft.com/office/word/2018/wordml" xmlns:w16du="http://schemas.microsoft.com/office/word/2023/wordml/word16du" xmlns:w16sdtdh="http://schemas.microsoft.com/office/word/2020/wordml/sdtdatahash" xmlns:w16sdtfl="http://schemas.microsoft.com/office/word/2024/wordml/sdtformatlock" xmlns:w16se="http://schemas.microsoft.com/office/word/2015/wordml/symex" xmlns:wpg="http://schemas.microsoft.com/office/word/2010/wordprocessingGroup" xmlns:wpi="http://schemas.microsoft.com/office/word/2010/wordprocessingInk" xmlns:wne="http://schemas.microsoft.com/office/word/2006/wordml" xmlns:wps="http://schemas.microsoft.com/office/word/2010/wordprocessingShape" mc:Ignorable="w14 w15 w16se w16cid w16 w16cex w16sdtdh w16sdtfl w16du wp14">
   <w:p>
     <w:pPr>
       <w:pStyle w:val="Header"/>
@@ -2118,7 +1702,7 @@
 </file>
 
 <file path=word/numbering.xml><?xml version="1.0" encoding="utf-8"?>
-<w:numbering xmlns:wpc="http://schemas.microsoft.com/office/word/2010/wordprocessingCanvas" xmlns:cx="http://schemas.microsoft.com/office/drawing/2014/chartex" xmlns:cx1="http://schemas.microsoft.com/office/drawing/2015/9/8/chartex" xmlns:cx2="http://schemas.microsoft.com/office/drawing/2015/10/21/chartex" xmlns:cx3="http://schemas.microsoft.com/office/drawing/2016/5/9/chartex" xmlns:cx4="http://schemas.microsoft.com/office/drawing/2016/5/10/chartex" xmlns:cx5="http://schemas.microsoft.com/office/drawing/2016/5/11/chartex" xmlns:cx6="http://schemas.microsoft.com/office/drawing/2016/5/12/chartex" xmlns:cx7="http://schemas.microsoft.com/office/drawing/2016/5/13/chartex" xmlns:cx8="http://schemas.microsoft.com/office/drawing/2016/5/14/chartex" xmlns:mc="http://schemas.openxmlformats.org/markup-compatibility/2006" xmlns:aink="http://schemas.microsoft.com/office/drawing/2016/ink" xmlns:am3d="http://schemas.microsoft.com/office/drawing/2017/model3d" xmlns:o="urn:schemas-microsoft-com:office:office" xmlns:oel="http://schemas.microsoft.com/office/2019/extlst" xmlns:r="http://schemas.openxmlformats.org/officeDocument/2006/relationships" xmlns:m="http://schemas.openxmlformats.org/officeDocument/2006/math" xmlns:v="urn:schemas-microsoft-com:vml" xmlns:wp14="http://schemas.microsoft.com/office/word/2010/wordprocessingDrawing" xmlns:wp="http://schemas.openxmlformats.org/drawingml/2006/wordprocessingDrawing" xmlns:w10="urn:schemas-microsoft-com:office:word" xmlns:w="http://schemas.openxmlformats.org/wordprocessingml/2006/main" xmlns:w14="http://schemas.microsoft.com/office/word/2010/wordml" xmlns:w15="http://schemas.microsoft.com/office/word/2012/wordml" xmlns:w16cex="http://schemas.microsoft.com/office/word/2018/wordml/cex" xmlns:w16cid="http://schemas.microsoft.com/office/word/2016/wordml/cid" xmlns:w16="http://schemas.microsoft.com/office/word/2018/wordml" xmlns:w16du="http://schemas.microsoft.com/office/word/2023/wordml/word16du" xmlns:w16sdtdh="http://schemas.microsoft.com/office/word/2020/wordml/sdtdatahash" xmlns:w16sdtfl="http://schemas.microsoft.com/office/word/2024/wordml/sdtformatlock" xmlns:w16se="http://schemas.microsoft.com/office/word/2015/wordml/symex" xmlns:wpg="http://schemas.microsoft.com/office/word/2010/wordprocessingGroup" xmlns:wpi="http://schemas.microsoft.com/office/word/2010/wordprocessingInk" xmlns:wne="http://schemas.microsoft.com/office/word/2006/wordml" xmlns:wps="http://schemas.microsoft.com/office/word/2010/wordprocessingShape" mc:Ignorable="w14 w15 w16se w16cid w16 w16cex w16sdtdh w16sdtfl w16du wp14">
+<w:numbering xmlns:wpc="http://schemas.microsoft.com/office/word/2010/wordprocessingCanvas" xmlns:cx="http://schemas.microsoft.com/office/drawing/2014/chartex" xmlns:cx1="http://schemas.microsoft.com/office/drawing/2015/9/8/chartex" xmlns:cx2="http://schemas.microsoft.com/office/drawing/2015/10/21/chartex" xmlns:cx3="http://schemas.microsoft.com/office/drawing/2016/5/9/chartex" xmlns:cx4="http://schemas.microsoft.com/office/drawing/2016/5/10/chartex" xmlns:cx5="http://schemas.microsoft.com/office/drawing/2016/5/11/chartex" xmlns:cx6="http://schemas.microsoft.com/office/drawing/2016/5/12/chartex" xmlns:cx7="http://schemas.microsoft.com/office/drawing/2016/5/13/chartex" xmlns:cx8="http://schemas.microsoft.com/office/drawing/2016/5/14/chartex" xmlns:mc="http://schemas.openxmlformats.org/markup-compatibility/2006" xmlns:aink="http://schemas.microsoft.com/office/drawing/2016/ink" xmlns:am3d="http://schemas.microsoft.com/office/drawing/2017/model3d" xmlns:o="urn:schemas-microsoft-com:office:office" xmlns:oel="http://schemas.microsoft.com/office/2019/extlst" xmlns:r="http://schemas.openxmlformats.org/officeDocument/2006/relationships" xmlns:m="http://schemas.openxmlformats.org/officeDocument/2006/math" xmlns:v="urn:schemas-microsoft-com:vml" xmlns:wp14="http://schemas.microsoft.com/office/word/2010/wordprocessingDrawing" xmlns:wp="http://schemas.openxmlformats.org/drawingml/2006/wordprocessingDrawing" xmlns:w10="urn:schemas-microsoft-com:office:word" xmlns:w="http://schemas.openxmlformats.org/wordprocessingml/2006/main" xmlns:w14="http://schemas.microsoft.com/office/word/2010/wordml" xmlns:w15="http://schemas.microsoft.com/office/word/2012/wordml" xmlns:w16cei="http://schemas.microsoft.com/office/word/2026/wordml/cei" xmlns:w16cex="http://schemas.microsoft.com/office/word/2018/wordml/cex" xmlns:w16cid="http://schemas.microsoft.com/office/word/2016/wordml/cid" xmlns:w16="http://schemas.microsoft.com/office/word/2018/wordml" xmlns:w16du="http://schemas.microsoft.com/office/word/2023/wordml/word16du" xmlns:w16sdtdh="http://schemas.microsoft.com/office/word/2020/wordml/sdtdatahash" xmlns:w16sdtfl="http://schemas.microsoft.com/office/word/2024/wordml/sdtformatlock" xmlns:w16se="http://schemas.microsoft.com/office/word/2015/wordml/symex" xmlns:wpg="http://schemas.microsoft.com/office/word/2010/wordprocessingGroup" xmlns:wpi="http://schemas.microsoft.com/office/word/2010/wordprocessingInk" xmlns:wne="http://schemas.microsoft.com/office/word/2006/wordml" xmlns:wps="http://schemas.microsoft.com/office/word/2010/wordprocessingShape" mc:Ignorable="w14 w15 w16se w16cid w16 w16cex w16sdtdh w16sdtfl w16du wp14">
   <w:abstractNum w:abstractNumId="0" w15:restartNumberingAfterBreak="0">
     <w:nsid w:val="27F0573B"/>
     <w:multiLevelType w:val="singleLevel"/>

</xml_diff>